<commit_message>
feat(users-devices): refine access plan and gate feedback
</commit_message>
<xml_diff>
--- a/modules/01_USERS_AND_DEVICES_CONTROL/docs/USER_GUIDE.docx
+++ b/modules/01_USERS_AND_DEVICES_CONTROL/docs/USER_GUIDE.docx
@@ -4,1351 +4,1989 @@
   <w:body>
     <w:p>
       <w:pPr>
+        <w:spacing w:after="60"/>
         <w:jc w:val="left"/>
       </w:pPr>
       <w:r>
         <w:rPr>
-          <w:rFonts w:ascii="Aptos Display" w:hAnsi="Aptos Display"/>
+          <w:rFonts w:ascii="Calibri" w:hAnsi="Calibri"/>
           <w:b/>
-          <w:color w:val="284A78"/>
-          <w:sz w:val="48"/>
+          <w:color w:val="1F4D78"/>
+          <w:sz w:val="40"/>
         </w:rPr>
-        <w:t>Users &amp; Devices Control User Guide</w:t>
+        <w:t>Users &amp; Devices Control - User Guide</w:t>
+      </w:r>
+    </w:p>
+    <w:tbl>
+      <w:tblPr>
+        <w:tblW w:type="auto" w:w="0"/>
+        <w:tblLayout w:type="autofit"/>
+        <w:tblLook w:firstColumn="1" w:firstRow="1" w:lastColumn="0" w:lastRow="0" w:noHBand="0" w:noVBand="1" w:val="04A0"/>
+      </w:tblPr>
+      <w:tblGrid>
+        <w:gridCol w:w="9360"/>
+      </w:tblGrid>
+      <w:tr>
+        <w:tc>
+          <w:tcPr>
+            <w:tcW w:type="dxa" w:w="9360"/>
+            <w:shd w:fill="D9E2EC"/>
+            <w:tcBorders>
+              <w:left w:val="single" w:sz="8" w:color="DADCE0"/>
+              <w:top w:val="single" w:sz="8" w:color="DADCE0"/>
+              <w:right w:val="single" w:sz="8" w:color="DADCE0"/>
+              <w:bottom w:val="single" w:sz="8" w:color="DADCE0"/>
+            </w:tcBorders>
+          </w:tcPr>
+          <w:p>
+            <w:pPr>
+              <w:spacing w:after="0"/>
+              <w:jc w:val="left"/>
+            </w:pPr>
+            <w:r/>
+            <w:r>
+              <w:rPr>
+                <w:rFonts w:ascii="Calibri" w:hAnsi="Calibri"/>
+                <w:b/>
+                <w:color w:val="1F4D78"/>
+                <w:sz w:val="24"/>
+              </w:rPr>
+              <w:t>Start here</w:t>
+            </w:r>
+          </w:p>
+        </w:tc>
+      </w:tr>
+      <w:tr>
+        <w:tc>
+          <w:tcPr>
+            <w:tcW w:type="dxa" w:w="9360"/>
+            <w:shd w:fill="F4F6F9"/>
+            <w:tcBorders>
+              <w:left w:val="single" w:sz="8" w:color="DADCE0"/>
+              <w:top w:val="single" w:sz="8" w:color="DADCE0"/>
+              <w:right w:val="single" w:sz="8" w:color="DADCE0"/>
+              <w:bottom w:val="single" w:sz="8" w:color="DADCE0"/>
+            </w:tcBorders>
+          </w:tcPr>
+          <w:p>
+            <w:pPr>
+              <w:spacing w:after="40"/>
+              <w:jc w:val="left"/>
+            </w:pPr>
+            <w:r/>
+          </w:p>
+          <w:p>
+            <w:r>
+              <w:t>If you are opening the module for the first time, do this first:</w:t>
+            </w:r>
+          </w:p>
+          <w:p>
+            <w:pPr>
+              <w:pStyle w:val="ListNumber"/>
+            </w:pPr>
+            <w:r>
+              <w:t>Open `Users &amp; Devices Control`.</w:t>
+            </w:r>
+          </w:p>
+          <w:p>
+            <w:pPr>
+              <w:pStyle w:val="ListNumber"/>
+            </w:pPr>
+            <w:r>
+              <w:t>Click `Reset demo data`.</w:t>
+            </w:r>
+          </w:p>
+          <w:p>
+            <w:pPr>
+              <w:pStyle w:val="ListNumber"/>
+            </w:pPr>
+            <w:r>
+              <w:t>Open `Users` and confirm `Hayley Arthur` exists.</w:t>
+            </w:r>
+          </w:p>
+          <w:p>
+            <w:pPr>
+              <w:pStyle w:val="ListNumber"/>
+            </w:pPr>
+            <w:r>
+              <w:t>Open `Devices` and confirm `NEW_EARTH_DEV` exists.</w:t>
+            </w:r>
+          </w:p>
+          <w:p>
+            <w:pPr>
+              <w:pStyle w:val="ListNumber"/>
+            </w:pPr>
+            <w:r>
+              <w:t>Open `Access Matrix` and confirm Treasury needs finance permission plus the trust floor.</w:t>
+            </w:r>
+          </w:p>
+          <w:p>
+            <w:pPr>
+              <w:pStyle w:val="ListNumber"/>
+            </w:pPr>
+            <w:r>
+              <w:t>Open the Treasury gate with the seeded user and device.</w:t>
+            </w:r>
+          </w:p>
+          <w:p>
+            <w:pPr>
+              <w:pStyle w:val="ListNumber"/>
+            </w:pPr>
+            <w:r>
+              <w:t>Check `Audit Log` after the decision.</w:t>
+            </w:r>
+          </w:p>
+        </w:tc>
+      </w:tr>
+    </w:tbl>
+    <w:p>
+      <w:pPr>
+        <w:pStyle w:val="Heading2"/>
+      </w:pPr>
+      <w:r>
+        <w:t>What it does</w:t>
       </w:r>
     </w:p>
     <w:p>
+      <w:pPr/>
       <w:r>
-        <w:rPr>
-          <w:rFonts w:ascii="Aptos" w:hAnsi="Aptos"/>
-          <w:color w:val="555555"/>
-          <w:sz w:val="24"/>
-        </w:rPr>
-        <w:t>Local security layer for identities, devices, approvals, and audit.</w:t>
+        <w:t>Use this module to check whether a user or device can open a sensitive dashboard area.</w:t>
       </w:r>
     </w:p>
     <w:p>
+      <w:pPr/>
       <w:r>
-        <w:rPr>
-          <w:rFonts w:ascii="Aptos" w:hAnsi="Aptos"/>
-          <w:b/>
-          <w:color w:val="3174B6"/>
-          <w:sz w:val="34"/>
-        </w:rPr>
-        <w:t>What this module is</w:t>
+        <w:t>It manages:</w:t>
       </w:r>
     </w:p>
     <w:p>
       <w:pPr>
-        <w:spacing w:after="80"/>
+        <w:pStyle w:val="ListBullet"/>
       </w:pPr>
       <w:r>
-        <w:rPr>
-          <w:rFonts w:ascii="Aptos" w:hAnsi="Aptos"/>
-          <w:sz w:val="22"/>
-        </w:rPr>
-        <w:t>Users &amp; Devices Control is the local security layer for the New Earth Command Dashboard. It manages users, devices, roles, permissions, trust levels, approvals, and audit events.</w:t>
+        <w:t>users</w:t>
       </w:r>
     </w:p>
     <w:p>
       <w:pPr>
-        <w:spacing w:after="80"/>
+        <w:pStyle w:val="ListBullet"/>
       </w:pPr>
       <w:r>
-        <w:rPr>
-          <w:rFonts w:ascii="Aptos" w:hAnsi="Aptos"/>
-          <w:sz w:val="22"/>
-        </w:rPr>
-        <w:t>The module stays local-first. It is the place to check whether a user or device is allowed to open a sensitive dashboard area.</w:t>
+        <w:t>devices</w:t>
       </w:r>
     </w:p>
     <w:p>
+      <w:pPr>
+        <w:pStyle w:val="ListBullet"/>
+      </w:pPr>
       <w:r>
-        <w:rPr>
-          <w:rFonts w:ascii="Aptos" w:hAnsi="Aptos"/>
-          <w:b/>
-          <w:color w:val="3174B6"/>
-          <w:sz w:val="34"/>
-        </w:rPr>
+        <w:t>roles</w:t>
+      </w:r>
+    </w:p>
+    <w:p>
+      <w:pPr>
+        <w:pStyle w:val="ListBullet"/>
+      </w:pPr>
+      <w:r>
+        <w:t>permissions</w:t>
+      </w:r>
+    </w:p>
+    <w:p>
+      <w:pPr>
+        <w:pStyle w:val="ListBullet"/>
+      </w:pPr>
+      <w:r>
+        <w:t>trust levels</w:t>
+      </w:r>
+    </w:p>
+    <w:p>
+      <w:pPr>
+        <w:pStyle w:val="ListBullet"/>
+      </w:pPr>
+      <w:r>
+        <w:t>approvals</w:t>
+      </w:r>
+    </w:p>
+    <w:p>
+      <w:pPr>
+        <w:pStyle w:val="ListBullet"/>
+      </w:pPr>
+      <w:r>
+        <w:t>audit events</w:t>
+      </w:r>
+    </w:p>
+    <w:p>
+      <w:pPr>
+        <w:pStyle w:val="Heading2"/>
+      </w:pPr>
+      <w:r>
         <w:t>Core rule</w:t>
       </w:r>
     </w:p>
     <w:p>
-      <w:pPr>
-        <w:spacing w:after="80"/>
-      </w:pPr>
+      <w:pPr/>
       <w:r>
-        <w:rPr>
-          <w:rFonts w:ascii="Aptos" w:hAnsi="Aptos"/>
-          <w:sz w:val="22"/>
-        </w:rPr>
-        <w:t>Before any sensitive module opens, the system should have:</w:t>
+        <w:t>Before a sensitive module opens, the system needs:</w:t>
       </w:r>
     </w:p>
     <w:p>
       <w:pPr>
         <w:pStyle w:val="ListBullet"/>
-        <w:spacing w:after="40"/>
       </w:pPr>
       <w:r>
-        <w:rPr>
-          <w:rFonts w:ascii="Aptos" w:hAnsi="Aptos"/>
-          <w:sz w:val="22"/>
-        </w:rPr>
-        <w:t>Identity</w:t>
+        <w:t>identity</w:t>
       </w:r>
     </w:p>
     <w:p>
       <w:pPr>
         <w:pStyle w:val="ListBullet"/>
-        <w:spacing w:after="40"/>
       </w:pPr>
       <w:r>
-        <w:rPr>
-          <w:rFonts w:ascii="Aptos" w:hAnsi="Aptos"/>
-          <w:sz w:val="22"/>
-        </w:rPr>
-        <w:t>Role</w:t>
+        <w:t>role</w:t>
       </w:r>
     </w:p>
     <w:p>
       <w:pPr>
         <w:pStyle w:val="ListBullet"/>
-        <w:spacing w:after="40"/>
       </w:pPr>
       <w:r>
-        <w:rPr>
-          <w:rFonts w:ascii="Aptos" w:hAnsi="Aptos"/>
-          <w:sz w:val="22"/>
-        </w:rPr>
-        <w:t>Permission</w:t>
+        <w:t>permission</w:t>
       </w:r>
     </w:p>
     <w:p>
       <w:pPr>
         <w:pStyle w:val="ListBullet"/>
-        <w:spacing w:after="40"/>
       </w:pPr>
       <w:r>
-        <w:rPr>
-          <w:rFonts w:ascii="Aptos" w:hAnsi="Aptos"/>
-          <w:sz w:val="22"/>
-        </w:rPr>
-        <w:t>Trust level</w:t>
+        <w:t>trust level</w:t>
       </w:r>
     </w:p>
     <w:p>
       <w:pPr>
         <w:pStyle w:val="ListBullet"/>
-        <w:spacing w:after="40"/>
       </w:pPr>
       <w:r>
-        <w:rPr>
-          <w:rFonts w:ascii="Aptos" w:hAnsi="Aptos"/>
-          <w:sz w:val="22"/>
-        </w:rPr>
-        <w:t>Audit trail</w:t>
+        <w:t>audit trail</w:t>
       </w:r>
     </w:p>
     <w:p>
-      <w:pPr>
-        <w:spacing w:after="80"/>
-      </w:pPr>
+      <w:pPr/>
       <w:r>
-        <w:rPr>
-          <w:rFonts w:ascii="Aptos" w:hAnsi="Aptos"/>
-          <w:sz w:val="22"/>
-        </w:rPr>
-        <w:t>If one of those is missing, the gate should explain what is missing and why.</w:t>
+        <w:t>If anything is missing, the gate should explain what is missing and why.</w:t>
       </w:r>
     </w:p>
     <w:p>
+      <w:pPr>
+        <w:pStyle w:val="Heading2"/>
+      </w:pPr>
       <w:r>
-        <w:rPr>
-          <w:rFonts w:ascii="Aptos" w:hAnsi="Aptos"/>
-          <w:b/>
-          <w:color w:val="3174B6"/>
-          <w:sz w:val="34"/>
-        </w:rPr>
-        <w:t>Where to find it</w:t>
+        <w:t>Treasury example</w:t>
       </w:r>
     </w:p>
     <w:p>
-      <w:pPr>
-        <w:spacing w:after="80"/>
-      </w:pPr>
+      <w:pPr/>
       <w:r>
-        <w:rPr>
-          <w:rFonts w:ascii="Aptos" w:hAnsi="Aptos"/>
-          <w:sz w:val="22"/>
-        </w:rPr>
-        <w:t>Open the Dashboard Module Hub, then choose:</w:t>
+        <w:t>Treasury is a good example because it is a sensitive finance area.</w:t>
       </w:r>
     </w:p>
     <w:p>
-      <w:pPr>
-        <w:pStyle w:val="ListBullet"/>
-        <w:spacing w:after="40"/>
-      </w:pPr>
+      <w:pPr/>
       <w:r>
-        <w:rPr>
-          <w:rFonts w:ascii="Aptos" w:hAnsi="Aptos"/>
-          <w:sz w:val="22"/>
-        </w:rPr>
-        <w:t>Users &amp; Devices Control</w:t>
+        <w:t>Current rules:</w:t>
       </w:r>
     </w:p>
     <w:p>
       <w:pPr>
-        <w:spacing w:after="80"/>
+        <w:pStyle w:val="ListBullet"/>
       </w:pPr>
       <w:r>
-        <w:rPr>
-          <w:rFonts w:ascii="Aptos" w:hAnsi="Aptos"/>
-          <w:sz w:val="22"/>
-        </w:rPr>
-        <w:t>You can also reach it from the module detail page for the same module through:</w:t>
+        <w:t>`finance.view` for viewing</w:t>
       </w:r>
     </w:p>
     <w:p>
       <w:pPr>
         <w:pStyle w:val="ListBullet"/>
-        <w:spacing w:after="40"/>
       </w:pPr>
       <w:r>
-        <w:rPr>
-          <w:rFonts w:ascii="Aptos" w:hAnsi="Aptos"/>
-          <w:sz w:val="22"/>
-        </w:rPr>
-        <w:t>Open access gate</w:t>
+        <w:t>`finance.edit` for editing</w:t>
       </w:r>
     </w:p>
     <w:p>
       <w:pPr>
         <w:pStyle w:val="ListBullet"/>
-        <w:spacing w:after="40"/>
       </w:pPr>
       <w:r>
-        <w:rPr>
-          <w:rFonts w:ascii="Aptos" w:hAnsi="Aptos"/>
-          <w:sz w:val="22"/>
-        </w:rPr>
-        <w:t>Open module route</w:t>
+        <w:t>`finance.admin` for the most sensitive finance control</w:t>
       </w:r>
     </w:p>
     <w:p>
+      <w:pPr>
+        <w:pStyle w:val="ListBullet"/>
+      </w:pPr>
       <w:r>
-        <w:rPr>
-          <w:rFonts w:ascii="Aptos" w:hAnsi="Aptos"/>
-          <w:b/>
-          <w:color w:val="3174B6"/>
-          <w:sz w:val="34"/>
-        </w:rPr>
-        <w:t>Main screens</w:t>
+        <w:t>trust level `4` or higher for module access</w:t>
       </w:r>
     </w:p>
     <w:p>
+      <w:pPr>
+        <w:pStyle w:val="ListBullet"/>
+      </w:pPr>
       <w:r>
-        <w:rPr>
-          <w:rFonts w:ascii="Aptos" w:hAnsi="Aptos"/>
-          <w:b/>
-          <w:color w:val="3174B6"/>
-          <w:sz w:val="34"/>
-        </w:rPr>
+        <w:t>approval for actions like `delete_record`, `export_data`, and `change_bank_details`</w:t>
+      </w:r>
+    </w:p>
+    <w:p>
+      <w:pPr/>
+      <w:r>
+        <w:t>Seeded example data:</w:t>
+      </w:r>
+    </w:p>
+    <w:p>
+      <w:pPr>
+        <w:pStyle w:val="ListBullet"/>
+      </w:pPr>
+      <w:r>
+        <w:t>`Hayley Arthur` is a `Co-founder` with finance view/edit access</w:t>
+      </w:r>
+    </w:p>
+    <w:p>
+      <w:pPr>
+        <w:pStyle w:val="ListBullet"/>
+      </w:pPr>
+      <w:r>
+        <w:t>`NEW_EARTH_DEV` is a trusted local device with trust level `4`</w:t>
+      </w:r>
+    </w:p>
+    <w:p>
+      <w:pPr>
+        <w:pStyle w:val="Heading2"/>
+      </w:pPr>
+      <w:r>
+        <w:t>How to use the seed demo</w:t>
+      </w:r>
+    </w:p>
+    <w:p>
+      <w:pPr/>
+      <w:r>
+        <w:t>Use the seed demo when you want a safe local test setup without building records by hand.</w:t>
+      </w:r>
+    </w:p>
+    <w:p>
+      <w:pPr>
+        <w:pStyle w:val="Heading3"/>
+      </w:pPr>
+      <w:r>
+        <w:t>Seed a sample user</w:t>
+      </w:r>
+    </w:p>
+    <w:p>
+      <w:pPr/>
+      <w:r>
+        <w:t>Use `Seed sample user` when you want a new local identity to test with.</w:t>
+      </w:r>
+    </w:p>
+    <w:p>
+      <w:pPr/>
+      <w:r>
+        <w:t>What it does:</w:t>
+      </w:r>
+    </w:p>
+    <w:p>
+      <w:pPr>
+        <w:pStyle w:val="ListBullet"/>
+      </w:pPr>
+      <w:r>
+        <w:t>adds a sample user record</w:t>
+      </w:r>
+    </w:p>
+    <w:p>
+      <w:pPr>
+        <w:pStyle w:val="ListBullet"/>
+      </w:pPr>
+      <w:r>
+        <w:t>gives you a user you can inspect in `Users`</w:t>
+      </w:r>
+    </w:p>
+    <w:p>
+      <w:pPr>
+        <w:pStyle w:val="ListBullet"/>
+      </w:pPr>
+      <w:r>
+        <w:t>helps you test the permission side of access</w:t>
+      </w:r>
+    </w:p>
+    <w:p>
+      <w:pPr/>
+      <w:r>
+        <w:t>When to use it:</w:t>
+      </w:r>
+    </w:p>
+    <w:p>
+      <w:pPr>
+        <w:pStyle w:val="ListBullet"/>
+      </w:pPr>
+      <w:r>
+        <w:t>you want to test a blocked or allowed user path</w:t>
+      </w:r>
+    </w:p>
+    <w:p>
+      <w:pPr>
+        <w:pStyle w:val="ListBullet"/>
+      </w:pPr>
+      <w:r>
+        <w:t>you want to compare a finance user with a lighter user</w:t>
+      </w:r>
+    </w:p>
+    <w:p>
+      <w:pPr>
+        <w:pStyle w:val="ListBullet"/>
+      </w:pPr>
+      <w:r>
+        <w:t>you want to reset the flow without creating a custom person first</w:t>
+      </w:r>
+    </w:p>
+    <w:p>
+      <w:pPr/>
+      <w:r>
+        <w:t>Click-by-click:</w:t>
+      </w:r>
+    </w:p>
+    <w:p>
+      <w:pPr>
+        <w:pStyle w:val="ListNumber"/>
+      </w:pPr>
+      <w:r>
+        <w:t>Open `Users`.</w:t>
+      </w:r>
+    </w:p>
+    <w:p>
+      <w:pPr>
+        <w:pStyle w:val="ListNumber"/>
+      </w:pPr>
+      <w:r>
+        <w:t>Click `Seed sample user`.</w:t>
+      </w:r>
+    </w:p>
+    <w:p>
+      <w:pPr>
+        <w:pStyle w:val="ListNumber"/>
+      </w:pPr>
+      <w:r>
+        <w:t>Wait for the new user card to appear.</w:t>
+      </w:r>
+    </w:p>
+    <w:p>
+      <w:pPr>
+        <w:pStyle w:val="ListNumber"/>
+      </w:pPr>
+      <w:r>
+        <w:t>Open the new user and check the role and permissions.</w:t>
+      </w:r>
+    </w:p>
+    <w:p>
+      <w:pPr>
+        <w:pStyle w:val="Heading3"/>
+      </w:pPr>
+      <w:r>
+        <w:t>Seed a sample device</w:t>
+      </w:r>
+    </w:p>
+    <w:p>
+      <w:pPr/>
+      <w:r>
+        <w:t>Use `Seed sample device` when you want a test device to work with.</w:t>
+      </w:r>
+    </w:p>
+    <w:p>
+      <w:pPr/>
+      <w:r>
+        <w:t>What it does:</w:t>
+      </w:r>
+    </w:p>
+    <w:p>
+      <w:pPr>
+        <w:pStyle w:val="ListBullet"/>
+      </w:pPr>
+      <w:r>
+        <w:t>adds a sample device record</w:t>
+      </w:r>
+    </w:p>
+    <w:p>
+      <w:pPr>
+        <w:pStyle w:val="ListBullet"/>
+      </w:pPr>
+      <w:r>
+        <w:t>gives you a device you can inspect in `Devices`</w:t>
+      </w:r>
+    </w:p>
+    <w:p>
+      <w:pPr>
+        <w:pStyle w:val="ListBullet"/>
+      </w:pPr>
+      <w:r>
+        <w:t>helps you test the trust side of access</w:t>
+      </w:r>
+    </w:p>
+    <w:p>
+      <w:pPr/>
+      <w:r>
+        <w:t>When to use it:</w:t>
+      </w:r>
+    </w:p>
+    <w:p>
+      <w:pPr>
+        <w:pStyle w:val="ListBullet"/>
+      </w:pPr>
+      <w:r>
+        <w:t>you want to test a low-trust or trusted device path</w:t>
+      </w:r>
+    </w:p>
+    <w:p>
+      <w:pPr>
+        <w:pStyle w:val="ListBullet"/>
+      </w:pPr>
+      <w:r>
+        <w:t>you want to compare one device against another</w:t>
+      </w:r>
+    </w:p>
+    <w:p>
+      <w:pPr>
+        <w:pStyle w:val="ListBullet"/>
+      </w:pPr>
+      <w:r>
+        <w:t>you want to check how the gate reacts to owner and trust changes</w:t>
+      </w:r>
+    </w:p>
+    <w:p>
+      <w:pPr/>
+      <w:r>
+        <w:t>Click-by-click:</w:t>
+      </w:r>
+    </w:p>
+    <w:p>
+      <w:pPr>
+        <w:pStyle w:val="ListNumber"/>
+      </w:pPr>
+      <w:r>
+        <w:t>Open `Devices`.</w:t>
+      </w:r>
+    </w:p>
+    <w:p>
+      <w:pPr>
+        <w:pStyle w:val="ListNumber"/>
+      </w:pPr>
+      <w:r>
+        <w:t>Click `Seed sample device`.</w:t>
+      </w:r>
+    </w:p>
+    <w:p>
+      <w:pPr>
+        <w:pStyle w:val="ListNumber"/>
+      </w:pPr>
+      <w:r>
+        <w:t>Wait for the new device card to appear.</w:t>
+      </w:r>
+    </w:p>
+    <w:p>
+      <w:pPr>
+        <w:pStyle w:val="ListNumber"/>
+      </w:pPr>
+      <w:r>
+        <w:t>Open the new device and check the trust level and owner.</w:t>
+      </w:r>
+    </w:p>
+    <w:p>
+      <w:pPr>
+        <w:pStyle w:val="Heading3"/>
+      </w:pPr>
+      <w:r>
+        <w:t>Create a sample approval</w:t>
+      </w:r>
+    </w:p>
+    <w:p>
+      <w:pPr/>
+      <w:r>
+        <w:t>Use `Create sample approval` when you want to watch the approval queue fill and clear.</w:t>
+      </w:r>
+    </w:p>
+    <w:p>
+      <w:pPr/>
+      <w:r>
+        <w:t>What it does:</w:t>
+      </w:r>
+    </w:p>
+    <w:p>
+      <w:pPr>
+        <w:pStyle w:val="ListBullet"/>
+      </w:pPr>
+      <w:r>
+        <w:t>adds a local approval request</w:t>
+      </w:r>
+    </w:p>
+    <w:p>
+      <w:pPr>
+        <w:pStyle w:val="ListBullet"/>
+      </w:pPr>
+      <w:r>
+        <w:t>gives you something to review in `Approval Queue`</w:t>
+      </w:r>
+    </w:p>
+    <w:p>
+      <w:pPr>
+        <w:pStyle w:val="ListBullet"/>
+      </w:pPr>
+      <w:r>
+        <w:t>helps you test the approval step without triggering a real risky action first</w:t>
+      </w:r>
+    </w:p>
+    <w:p>
+      <w:pPr/>
+      <w:r>
+        <w:t>When to use it:</w:t>
+      </w:r>
+    </w:p>
+    <w:p>
+      <w:pPr>
+        <w:pStyle w:val="ListBullet"/>
+      </w:pPr>
+      <w:r>
+        <w:t>you want to test the approve and deny buttons</w:t>
+      </w:r>
+    </w:p>
+    <w:p>
+      <w:pPr>
+        <w:pStyle w:val="ListBullet"/>
+      </w:pPr>
+      <w:r>
+        <w:t>you want to see how the audit trail records approval handling</w:t>
+      </w:r>
+    </w:p>
+    <w:p>
+      <w:pPr>
+        <w:pStyle w:val="ListBullet"/>
+      </w:pPr>
+      <w:r>
+        <w:t>you want to confirm the queue is wired correctly</w:t>
+      </w:r>
+    </w:p>
+    <w:p>
+      <w:pPr/>
+      <w:r>
+        <w:t>Click-by-click:</w:t>
+      </w:r>
+    </w:p>
+    <w:p>
+      <w:pPr>
+        <w:pStyle w:val="ListNumber"/>
+      </w:pPr>
+      <w:r>
+        <w:t>Open `Approval Queue`.</w:t>
+      </w:r>
+    </w:p>
+    <w:p>
+      <w:pPr>
+        <w:pStyle w:val="ListNumber"/>
+      </w:pPr>
+      <w:r>
+        <w:t>Click `Create sample approval`.</w:t>
+      </w:r>
+    </w:p>
+    <w:p>
+      <w:pPr>
+        <w:pStyle w:val="ListNumber"/>
+      </w:pPr>
+      <w:r>
+        <w:t>Review the new request.</w:t>
+      </w:r>
+    </w:p>
+    <w:p>
+      <w:pPr>
+        <w:pStyle w:val="ListNumber"/>
+      </w:pPr>
+      <w:r>
+        <w:t>Approve it or deny it.</w:t>
+      </w:r>
+    </w:p>
+    <w:p>
+      <w:pPr>
+        <w:pStyle w:val="ListNumber"/>
+      </w:pPr>
+      <w:r>
+        <w:t>Check `Audit Log` to see the recorded decision.</w:t>
+      </w:r>
+    </w:p>
+    <w:p>
+      <w:pPr>
+        <w:pStyle w:val="Heading3"/>
+      </w:pPr>
+      <w:r>
+        <w:t>Reset demo data</w:t>
+      </w:r>
+    </w:p>
+    <w:p>
+      <w:pPr/>
+      <w:r>
+        <w:t>Use `Reset demo data` when you want to return to the seeded local state.</w:t>
+      </w:r>
+    </w:p>
+    <w:p>
+      <w:pPr/>
+      <w:r>
+        <w:t>What it does:</w:t>
+      </w:r>
+    </w:p>
+    <w:p>
+      <w:pPr>
+        <w:pStyle w:val="ListBullet"/>
+      </w:pPr>
+      <w:r>
+        <w:t>clears the current demo state</w:t>
+      </w:r>
+    </w:p>
+    <w:p>
+      <w:pPr>
+        <w:pStyle w:val="ListBullet"/>
+      </w:pPr>
+      <w:r>
+        <w:t>restores the seeded users, devices, approvals, and audit entries</w:t>
+      </w:r>
+    </w:p>
+    <w:p>
+      <w:pPr>
+        <w:pStyle w:val="ListBullet"/>
+      </w:pPr>
+      <w:r>
+        <w:t>gives you a known starting point for repeat testing</w:t>
+      </w:r>
+    </w:p>
+    <w:p>
+      <w:pPr/>
+      <w:r>
+        <w:t>When to use it:</w:t>
+      </w:r>
+    </w:p>
+    <w:p>
+      <w:pPr>
+        <w:pStyle w:val="ListBullet"/>
+      </w:pPr>
+      <w:r>
+        <w:t>you have changed the seed data and want a fresh start</w:t>
+      </w:r>
+    </w:p>
+    <w:p>
+      <w:pPr>
+        <w:pStyle w:val="ListBullet"/>
+      </w:pPr>
+      <w:r>
+        <w:t>you want to repeat the same test several times</w:t>
+      </w:r>
+    </w:p>
+    <w:p>
+      <w:pPr>
+        <w:pStyle w:val="ListBullet"/>
+      </w:pPr>
+      <w:r>
+        <w:t>you want to compare a clean allow path with a blocked path</w:t>
+      </w:r>
+    </w:p>
+    <w:p>
+      <w:pPr/>
+      <w:r>
+        <w:t>Click-by-click:</w:t>
+      </w:r>
+    </w:p>
+    <w:p>
+      <w:pPr>
+        <w:pStyle w:val="ListNumber"/>
+      </w:pPr>
+      <w:r>
+        <w:t>Open `Users &amp; Devices Control`.</w:t>
+      </w:r>
+    </w:p>
+    <w:p>
+      <w:pPr>
+        <w:pStyle w:val="ListNumber"/>
+      </w:pPr>
+      <w:r>
+        <w:t>Click `Reset demo data`.</w:t>
+      </w:r>
+    </w:p>
+    <w:p>
+      <w:pPr>
+        <w:pStyle w:val="ListNumber"/>
+      </w:pPr>
+      <w:r>
+        <w:t>Wait for the seeded users, devices, approvals, and audit entries to come back.</w:t>
+      </w:r>
+    </w:p>
+    <w:p>
+      <w:pPr>
+        <w:pStyle w:val="ListNumber"/>
+      </w:pPr>
+      <w:r>
+        <w:t>Start the checklist again from the top.</w:t>
+      </w:r>
+    </w:p>
+    <w:p>
+      <w:pPr>
+        <w:pStyle w:val="Heading2"/>
+      </w:pPr>
+      <w:r>
+        <w:t>Quick test checklist</w:t>
+      </w:r>
+    </w:p>
+    <w:p>
+      <w:pPr>
+        <w:pStyle w:val="ListNumber"/>
+      </w:pPr>
+      <w:r>
+        <w:t>Open `Users &amp; Devices Control`.</w:t>
+      </w:r>
+    </w:p>
+    <w:p>
+      <w:pPr>
+        <w:pStyle w:val="ListNumber"/>
+      </w:pPr>
+      <w:r>
+        <w:t>Click `Reset demo data`.</w:t>
+      </w:r>
+    </w:p>
+    <w:p>
+      <w:pPr>
+        <w:pStyle w:val="ListNumber"/>
+      </w:pPr>
+      <w:r>
+        <w:t>Open `Users` and confirm `Hayley Arthur` is active.</w:t>
+      </w:r>
+    </w:p>
+    <w:p>
+      <w:pPr>
+        <w:pStyle w:val="ListNumber"/>
+      </w:pPr>
+      <w:r>
+        <w:t>Open `Devices` and confirm `NEW_EARTH_DEV` is trust level `4`.</w:t>
+      </w:r>
+    </w:p>
+    <w:p>
+      <w:pPr>
+        <w:pStyle w:val="ListNumber"/>
+      </w:pPr>
+      <w:r>
+        <w:t>Open `Access Matrix` and confirm Treasury needs finance permission plus the trust floor.</w:t>
+      </w:r>
+    </w:p>
+    <w:p>
+      <w:pPr>
+        <w:pStyle w:val="ListNumber"/>
+      </w:pPr>
+      <w:r>
+        <w:t>Open the Treasury gate with `Hayley Arthur` and `NEW_EARTH_DEV`.</w:t>
+      </w:r>
+    </w:p>
+    <w:p>
+      <w:pPr>
+        <w:pStyle w:val="ListNumber"/>
+      </w:pPr>
+      <w:r>
+        <w:t>Confirm a normal Treasury open is allowed.</w:t>
+      </w:r>
+    </w:p>
+    <w:p>
+      <w:pPr>
+        <w:pStyle w:val="ListNumber"/>
+      </w:pPr>
+      <w:r>
+        <w:t>Switch to a low-trust device or lighter user and confirm the gate blocks access.</w:t>
+      </w:r>
+    </w:p>
+    <w:p>
+      <w:pPr>
+        <w:pStyle w:val="ListNumber"/>
+      </w:pPr>
+      <w:r>
+        <w:t>Try an approval-required action if the screen offers one.</w:t>
+      </w:r>
+    </w:p>
+    <w:p>
+      <w:pPr>
+        <w:pStyle w:val="ListNumber"/>
+      </w:pPr>
+      <w:r>
+        <w:t>Open `Audit Log` and confirm the allow, deny, or approval event was written.</w:t>
+      </w:r>
+    </w:p>
+    <w:p>
+      <w:pPr>
+        <w:pStyle w:val="Heading2"/>
+      </w:pPr>
+      <w:r>
+        <w:t>Step-by-step Treasury walkthrough</w:t>
+      </w:r>
+    </w:p>
+    <w:p>
+      <w:pPr/>
+      <w:r>
+        <w:t>Use this when you want to test Treasury in order and see each decision point.</w:t>
+      </w:r>
+    </w:p>
+    <w:p>
+      <w:pPr>
+        <w:pStyle w:val="ListNumber"/>
+      </w:pPr>
+      <w:r>
+        <w:t>Open the Dashboard Module Hub.</w:t>
+      </w:r>
+    </w:p>
+    <w:p>
+      <w:pPr/>
+      <w:r>
+        <w:t>Why this matters: this is the entry point that decides whether the security layer is in the path.</w:t>
+      </w:r>
+    </w:p>
+    <w:p>
+      <w:pPr>
+        <w:pStyle w:val="ListNumber"/>
+      </w:pPr>
+      <w:r>
+        <w:t>Select `Users &amp; Devices Control`.</w:t>
+      </w:r>
+    </w:p>
+    <w:p>
+      <w:pPr/>
+      <w:r>
+        <w:t>Why this matters: you want the local registry open before you test any sensitive access.</w:t>
+      </w:r>
+    </w:p>
+    <w:p>
+      <w:pPr>
+        <w:pStyle w:val="ListNumber"/>
+      </w:pPr>
+      <w:r>
+        <w:t>Open `Users`.</w:t>
+      </w:r>
+    </w:p>
+    <w:p>
+      <w:pPr/>
+      <w:r>
+        <w:t>Why this matters: the user must exist and be active before Treasury can open.</w:t>
+      </w:r>
+    </w:p>
+    <w:p>
+      <w:pPr>
+        <w:pStyle w:val="ListNumber"/>
+      </w:pPr>
+      <w:r>
+        <w:t>Find `Hayley Arthur`.</w:t>
+      </w:r>
+    </w:p>
+    <w:p>
+      <w:pPr/>
+      <w:r>
+        <w:t>Why this matters: she is the seeded finance example for testing the normal path.</w:t>
+      </w:r>
+    </w:p>
+    <w:p>
+      <w:pPr>
+        <w:pStyle w:val="ListNumber"/>
+      </w:pPr>
+      <w:r>
+        <w:t>Confirm the user is active and has finance access.</w:t>
+      </w:r>
+    </w:p>
+    <w:p>
+      <w:pPr/>
+      <w:r>
+        <w:t>Why this matters: the role and permission must both support finance work.</w:t>
+      </w:r>
+    </w:p>
+    <w:p>
+      <w:pPr>
+        <w:pStyle w:val="ListNumber"/>
+      </w:pPr>
+      <w:r>
+        <w:t>Open `Devices`.</w:t>
+      </w:r>
+    </w:p>
+    <w:p>
+      <w:pPr/>
+      <w:r>
+        <w:t>Why this matters: device trust is part of the access decision, not just the user.</w:t>
+      </w:r>
+    </w:p>
+    <w:p>
+      <w:pPr>
+        <w:pStyle w:val="ListNumber"/>
+      </w:pPr>
+      <w:r>
+        <w:t>Find `NEW_EARTH_DEV`.</w:t>
+      </w:r>
+    </w:p>
+    <w:p>
+      <w:pPr/>
+      <w:r>
+        <w:t>Why this matters: it is the seeded trusted device for the normal Treasury path.</w:t>
+      </w:r>
+    </w:p>
+    <w:p>
+      <w:pPr>
+        <w:pStyle w:val="ListNumber"/>
+      </w:pPr>
+      <w:r>
+        <w:t>Confirm the device is trusted at level `4`.</w:t>
+      </w:r>
+    </w:p>
+    <w:p>
+      <w:pPr/>
+      <w:r>
+        <w:t>Why this matters: Treasury requires the trust floor to be met.</w:t>
+      </w:r>
+    </w:p>
+    <w:p>
+      <w:pPr>
+        <w:pStyle w:val="ListNumber"/>
+      </w:pPr>
+      <w:r>
+        <w:t>Open `Access Matrix`.</w:t>
+      </w:r>
+    </w:p>
+    <w:p>
+      <w:pPr/>
+      <w:r>
+        <w:t>Why this matters: the rule tells you what Treasury needs before you try the gate.</w:t>
+      </w:r>
+    </w:p>
+    <w:p>
+      <w:pPr>
+        <w:pStyle w:val="ListNumber"/>
+      </w:pPr>
+      <w:r>
+        <w:t>Confirm Treasury needs finance permission and a trust floor of `4`.</w:t>
+      </w:r>
+    </w:p>
+    <w:p>
+      <w:pPr/>
+      <w:r>
+        <w:t>Why this matters: it confirms the system will check both permission and trust.</w:t>
+      </w:r>
+    </w:p>
+    <w:p>
+      <w:pPr>
+        <w:pStyle w:val="ListNumber"/>
+      </w:pPr>
+      <w:r>
+        <w:t>Open the Treasury gate.</w:t>
+      </w:r>
+    </w:p>
+    <w:p>
+      <w:pPr/>
+      <w:r>
+        <w:t>Why this matters: this is the actual check before Treasury opens.</w:t>
+      </w:r>
+    </w:p>
+    <w:p>
+      <w:pPr>
+        <w:pStyle w:val="ListNumber"/>
+      </w:pPr>
+      <w:r>
+        <w:t>Select `Hayley Arthur` and `NEW_EARTH_DEV`.</w:t>
+      </w:r>
+    </w:p>
+    <w:p>
+      <w:pPr/>
+      <w:r>
+        <w:t>Why this matters: the gate needs both the user and device selected at the same time.</w:t>
+      </w:r>
+    </w:p>
+    <w:p>
+      <w:pPr>
+        <w:pStyle w:val="ListNumber"/>
+      </w:pPr>
+      <w:r>
+        <w:t>Click `Open screen`.</w:t>
+      </w:r>
+    </w:p>
+    <w:p>
+      <w:pPr/>
+      <w:r>
+        <w:t>Why this matters: this is the moment the gate either allows or blocks access.</w:t>
+      </w:r>
+    </w:p>
+    <w:p>
+      <w:pPr>
+        <w:pStyle w:val="ListNumber"/>
+      </w:pPr>
+      <w:r>
+        <w:t>If Treasury opens, test a normal view action.</w:t>
+      </w:r>
+    </w:p>
+    <w:p>
+      <w:pPr/>
+      <w:r>
+        <w:t>Why this matters: it proves the normal finance path works after the gate passes.</w:t>
+      </w:r>
+    </w:p>
+    <w:p>
+      <w:pPr>
+        <w:pStyle w:val="ListNumber"/>
+      </w:pPr>
+      <w:r>
+        <w:t>If the gate blocks, read `Why blocked` and fix the missing identity, permission, trust, or approval.</w:t>
+      </w:r>
+    </w:p>
+    <w:p>
+      <w:pPr/>
+      <w:r>
+        <w:t>Why this matters: the block message tells you exactly which part of the rule failed.</w:t>
+      </w:r>
+    </w:p>
+    <w:p>
+      <w:pPr>
+        <w:pStyle w:val="ListNumber"/>
+      </w:pPr>
+      <w:r>
+        <w:t>If the action needs approval, open `Approval Queue`.</w:t>
+      </w:r>
+    </w:p>
+    <w:p>
+      <w:pPr/>
+      <w:r>
+        <w:t>Why this matters: approval-required actions should pause for human review.</w:t>
+      </w:r>
+    </w:p>
+    <w:p>
+      <w:pPr>
+        <w:pStyle w:val="ListNumber"/>
+      </w:pPr>
+      <w:r>
+        <w:t>Review the pending request.</w:t>
+      </w:r>
+    </w:p>
+    <w:p>
+      <w:pPr/>
+      <w:r>
+        <w:t>Why this matters: you need to confirm the request is the one you meant to test.</w:t>
+      </w:r>
+    </w:p>
+    <w:p>
+      <w:pPr>
+        <w:pStyle w:val="ListNumber"/>
+      </w:pPr>
+      <w:r>
+        <w:t>Approve or deny the request.</w:t>
+      </w:r>
+    </w:p>
+    <w:p>
+      <w:pPr/>
+      <w:r>
+        <w:t>Why this matters: this is the human decision point for sensitive actions.</w:t>
+      </w:r>
+    </w:p>
+    <w:p>
+      <w:pPr>
+        <w:pStyle w:val="ListNumber"/>
+      </w:pPr>
+      <w:r>
+        <w:t>Try the action again if approval was granted.</w:t>
+      </w:r>
+    </w:p>
+    <w:p>
+      <w:pPr/>
+      <w:r>
+        <w:t>Why this matters: the action should only continue after approval has been recorded.</w:t>
+      </w:r>
+    </w:p>
+    <w:p>
+      <w:pPr>
+        <w:pStyle w:val="ListNumber"/>
+      </w:pPr>
+      <w:r>
+        <w:t>Open `Audit Log` and confirm the decision was recorded.</w:t>
+      </w:r>
+    </w:p>
+    <w:p>
+      <w:pPr/>
+      <w:r>
+        <w:t>Why this matters: the audit trail proves what happened and why.</w:t>
+      </w:r>
+    </w:p>
+    <w:p>
+      <w:pPr/>
+      <w:r>
+        <w:t>What you should see:</w:t>
+      </w:r>
+    </w:p>
+    <w:p>
+      <w:pPr>
+        <w:pStyle w:val="ListBullet"/>
+      </w:pPr>
+      <w:r>
+        <w:t>The Treasury gate shows the selected user and device.</w:t>
+      </w:r>
+    </w:p>
+    <w:p>
+      <w:pPr>
+        <w:pStyle w:val="ListBullet"/>
+      </w:pPr>
+      <w:r>
+        <w:t>A valid Treasury setup opens the screen.</w:t>
+      </w:r>
+    </w:p>
+    <w:p>
+      <w:pPr>
+        <w:pStyle w:val="ListBullet"/>
+      </w:pPr>
+      <w:r>
+        <w:t>A bad setup shows `Why blocked`.</w:t>
+      </w:r>
+    </w:p>
+    <w:p>
+      <w:pPr>
+        <w:pStyle w:val="ListBullet"/>
+      </w:pPr>
+      <w:r>
+        <w:t>An approval-only action moves into `Approval Queue`.</w:t>
+      </w:r>
+    </w:p>
+    <w:p>
+      <w:pPr>
+        <w:pStyle w:val="ListBullet"/>
+      </w:pPr>
+      <w:r>
+        <w:t>The final decision appears in `Audit Log`.</w:t>
+      </w:r>
+    </w:p>
+    <w:p>
+      <w:pPr>
+        <w:pStyle w:val="Heading2"/>
+      </w:pPr>
+      <w:r>
+        <w:t>Step-by-step access system walkthrough</w:t>
+      </w:r>
+    </w:p>
+    <w:p>
+      <w:pPr/>
+      <w:r>
+        <w:t>Use this when you want to test the whole access system from start to finish.</w:t>
+      </w:r>
+    </w:p>
+    <w:p>
+      <w:pPr>
+        <w:pStyle w:val="ListNumber"/>
+      </w:pPr>
+      <w:r>
+        <w:t>Open `Users &amp; Devices Control`.</w:t>
+      </w:r>
+    </w:p>
+    <w:p>
+      <w:pPr/>
+      <w:r>
+        <w:t>Why this matters: you want the access system reset to a known local state.</w:t>
+      </w:r>
+    </w:p>
+    <w:p>
+      <w:pPr>
+        <w:pStyle w:val="ListNumber"/>
+      </w:pPr>
+      <w:r>
+        <w:t>Click `Reset demo data`.</w:t>
+      </w:r>
+    </w:p>
+    <w:p>
+      <w:pPr/>
+      <w:r>
+        <w:t>Why this matters: a clean seed state makes the later test results easier to trust.</w:t>
+      </w:r>
+    </w:p>
+    <w:p>
+      <w:pPr>
+        <w:pStyle w:val="ListNumber"/>
+      </w:pPr>
+      <w:r>
+        <w:t>Open `Users` and check the sample users.</w:t>
+      </w:r>
+    </w:p>
+    <w:p>
+      <w:pPr/>
+      <w:r>
+        <w:t>Why this matters: you need to know which identities are available for the test.</w:t>
+      </w:r>
+    </w:p>
+    <w:p>
+      <w:pPr>
+        <w:pStyle w:val="ListNumber"/>
+      </w:pPr>
+      <w:r>
+        <w:t>Open `Devices` and compare the trust levels.</w:t>
+      </w:r>
+    </w:p>
+    <w:p>
+      <w:pPr/>
+      <w:r>
+        <w:t>Why this matters: the trust floor only makes sense when you compare devices side by side.</w:t>
+      </w:r>
+    </w:p>
+    <w:p>
+      <w:pPr>
+        <w:pStyle w:val="ListNumber"/>
+      </w:pPr>
+      <w:r>
+        <w:t>Open `Access Matrix` and inspect Treasury rules.</w:t>
+      </w:r>
+    </w:p>
+    <w:p>
+      <w:pPr/>
+      <w:r>
+        <w:t>Why this matters: the rule tells you what the gate will accept or reject.</w:t>
+      </w:r>
+    </w:p>
+    <w:p>
+      <w:pPr>
+        <w:pStyle w:val="ListNumber"/>
+      </w:pPr>
+      <w:r>
+        <w:t>Open the Treasury gate with a trusted user and device.</w:t>
+      </w:r>
+    </w:p>
+    <w:p>
+      <w:pPr/>
+      <w:r>
+        <w:t>Why this matters: this is the main allow path you want to prove works.</w:t>
+      </w:r>
+    </w:p>
+    <w:p>
+      <w:pPr>
+        <w:pStyle w:val="ListNumber"/>
+      </w:pPr>
+      <w:r>
+        <w:t>Confirm the allow path works.</w:t>
+      </w:r>
+    </w:p>
+    <w:p>
+      <w:pPr/>
+      <w:r>
+        <w:t>Why this matters: it shows the basic role, trust, and permission combo is valid.</w:t>
+      </w:r>
+    </w:p>
+    <w:p>
+      <w:pPr>
+        <w:pStyle w:val="ListNumber"/>
+      </w:pPr>
+      <w:r>
+        <w:t>Switch to a lower-trust device and confirm the block path works.</w:t>
+      </w:r>
+    </w:p>
+    <w:p>
+      <w:pPr/>
+      <w:r>
+        <w:t>Why this matters: the system should reject devices that do not meet Treasury's trust floor.</w:t>
+      </w:r>
+    </w:p>
+    <w:p>
+      <w:pPr>
+        <w:pStyle w:val="ListNumber"/>
+      </w:pPr>
+      <w:r>
+        <w:t>Switch to a lighter user and confirm the permission block works.</w:t>
+      </w:r>
+    </w:p>
+    <w:p>
+      <w:pPr/>
+      <w:r>
+        <w:t>Why this matters: the system should reject users who lack the needed finance access.</w:t>
+      </w:r>
+    </w:p>
+    <w:p>
+      <w:pPr>
+        <w:pStyle w:val="ListNumber"/>
+      </w:pPr>
+      <w:r>
+        <w:t>Trigger an approval-required action and confirm it pauses for review.</w:t>
+      </w:r>
+    </w:p>
+    <w:p>
+      <w:pPr/>
+      <w:r>
+        <w:t>Why this matters: sensitive actions should not execute instantly.</w:t>
+      </w:r>
+    </w:p>
+    <w:p>
+      <w:pPr>
+        <w:pStyle w:val="ListNumber"/>
+      </w:pPr>
+      <w:r>
+        <w:t>Open `Approval Queue` and process the request.</w:t>
+      </w:r>
+    </w:p>
+    <w:p>
+      <w:pPr/>
+      <w:r>
+        <w:t>Why this matters: human review is the control point for risky actions.</w:t>
+      </w:r>
+    </w:p>
+    <w:p>
+      <w:pPr>
+        <w:pStyle w:val="ListNumber"/>
+      </w:pPr>
+      <w:r>
+        <w:t>Review the result in `Audit Log`.</w:t>
+      </w:r>
+    </w:p>
+    <w:p>
+      <w:pPr/>
+      <w:r>
+        <w:t>Why this matters: every allow, deny, or approval should leave a trace.</w:t>
+      </w:r>
+    </w:p>
+    <w:p>
+      <w:pPr>
+        <w:pStyle w:val="ListNumber"/>
+      </w:pPr>
+      <w:r>
+        <w:t>Open `Device Onboarding` and register a sample device if you want to test trust setup.</w:t>
+      </w:r>
+    </w:p>
+    <w:p>
+      <w:pPr/>
+      <w:r>
+        <w:t>Why this matters: onboarding is how a device becomes trusted enough for later access.</w:t>
+      </w:r>
+    </w:p>
+    <w:p>
+      <w:pPr>
+        <w:pStyle w:val="ListNumber"/>
+      </w:pPr>
+      <w:r>
+        <w:t>Open `Security Lock` and confirm the selected context matches what you expect.</w:t>
+      </w:r>
+    </w:p>
+    <w:p>
+      <w:pPr/>
+      <w:r>
+        <w:t>Why this matters: the lock view is a quick sanity check for the current local context.</w:t>
+      </w:r>
+    </w:p>
+    <w:p>
+      <w:pPr>
+        <w:pStyle w:val="ListNumber"/>
+      </w:pPr>
+      <w:r>
+        <w:t>Reset demo data and repeat the flow until the results feel familiar.</w:t>
+      </w:r>
+    </w:p>
+    <w:p>
+      <w:pPr/>
+      <w:r>
+        <w:t>Why this matters: repetition makes the rules easier to trust and remember.</w:t>
+      </w:r>
+    </w:p>
+    <w:p>
+      <w:pPr/>
+      <w:r>
+        <w:t>What you should see:</w:t>
+      </w:r>
+    </w:p>
+    <w:p>
+      <w:pPr>
+        <w:pStyle w:val="ListBullet"/>
+      </w:pPr>
+      <w:r>
+        <w:t>The trusted user and device path is allowed.</w:t>
+      </w:r>
+    </w:p>
+    <w:p>
+      <w:pPr>
+        <w:pStyle w:val="ListBullet"/>
+      </w:pPr>
+      <w:r>
+        <w:t>The low-trust device path is blocked.</w:t>
+      </w:r>
+    </w:p>
+    <w:p>
+      <w:pPr>
+        <w:pStyle w:val="ListBullet"/>
+      </w:pPr>
+      <w:r>
+        <w:t>The lighter user path is blocked for permission reasons.</w:t>
+      </w:r>
+    </w:p>
+    <w:p>
+      <w:pPr>
+        <w:pStyle w:val="ListBullet"/>
+      </w:pPr>
+      <w:r>
+        <w:t>The approval path pauses until review happens.</w:t>
+      </w:r>
+    </w:p>
+    <w:p>
+      <w:pPr>
+        <w:pStyle w:val="ListBullet"/>
+      </w:pPr>
+      <w:r>
+        <w:t>Device onboarding writes a new trusted record.</w:t>
+      </w:r>
+    </w:p>
+    <w:p>
+      <w:pPr>
+        <w:pStyle w:val="ListBullet"/>
+      </w:pPr>
+      <w:r>
+        <w:t>Security Lock matches the current local context.</w:t>
+      </w:r>
+    </w:p>
+    <w:p>
+      <w:pPr>
+        <w:pStyle w:val="Heading2"/>
+      </w:pPr>
+      <w:r>
+        <w:t>What each screen is for</w:t>
+      </w:r>
+    </w:p>
+    <w:p>
+      <w:pPr>
+        <w:pStyle w:val="Heading3"/>
+      </w:pPr>
+      <w:r>
         <w:t>Users</w:t>
       </w:r>
     </w:p>
     <w:p>
-      <w:pPr>
-        <w:spacing w:after="80"/>
-      </w:pPr>
+      <w:pPr/>
       <w:r>
-        <w:rPr>
-          <w:rFonts w:ascii="Aptos" w:hAnsi="Aptos"/>
-          <w:sz w:val="22"/>
-        </w:rPr>
-        <w:t>Use this screen to manage local identities.</w:t>
+        <w:t>Check the person. Confirm the role, permissions, and linked devices.</w:t>
       </w:r>
     </w:p>
     <w:p>
       <w:pPr>
-        <w:spacing w:after="80"/>
+        <w:pStyle w:val="Heading3"/>
       </w:pPr>
       <w:r>
-        <w:rPr>
-          <w:rFonts w:ascii="Aptos" w:hAnsi="Aptos"/>
-          <w:sz w:val="22"/>
-        </w:rPr>
-        <w:t>Add a user, edit a user, archive or restore a user, delete a user, or seed a sample user for testing.</w:t>
-      </w:r>
-    </w:p>
-    <w:p>
-      <w:pPr>
-        <w:spacing w:after="80"/>
-      </w:pPr>
-      <w:r>
-        <w:rPr>
-          <w:rFonts w:ascii="Aptos" w:hAnsi="Aptos"/>
-          <w:sz w:val="22"/>
-        </w:rPr>
-        <w:t>Check display name, role, title, linked devices, permissions, and notes.</w:t>
-      </w:r>
-    </w:p>
-    <w:p>
-      <w:r>
-        <w:rPr>
-          <w:rFonts w:ascii="Aptos" w:hAnsi="Aptos"/>
-          <w:b/>
-          <w:color w:val="3174B6"/>
-          <w:sz w:val="34"/>
-        </w:rPr>
         <w:t>Devices</w:t>
       </w:r>
     </w:p>
     <w:p>
-      <w:pPr>
-        <w:spacing w:after="80"/>
-      </w:pPr>
+      <w:pPr/>
       <w:r>
-        <w:rPr>
-          <w:rFonts w:ascii="Aptos" w:hAnsi="Aptos"/>
-          <w:sz w:val="22"/>
-        </w:rPr>
-        <w:t>Use this screen to manage local devices.</w:t>
+        <w:t>Check the device. Confirm the trust level, owner, and allowed actions.</w:t>
       </w:r>
     </w:p>
     <w:p>
       <w:pPr>
-        <w:spacing w:after="80"/>
+        <w:pStyle w:val="Heading3"/>
       </w:pPr>
       <w:r>
-        <w:rPr>
-          <w:rFonts w:ascii="Aptos" w:hAnsi="Aptos"/>
-          <w:sz w:val="22"/>
-        </w:rPr>
-        <w:t>Add a device, edit a device, archive or restore a device, delete a device, or seed a sample device.</w:t>
-      </w:r>
-    </w:p>
-    <w:p>
-      <w:pPr>
-        <w:spacing w:after="80"/>
-      </w:pPr>
-      <w:r>
-        <w:rPr>
-          <w:rFonts w:ascii="Aptos" w:hAnsi="Aptos"/>
-          <w:sz w:val="22"/>
-        </w:rPr>
-        <w:t>Check device name, type, trust level, owner, allowed actions, and notes.</w:t>
-      </w:r>
-    </w:p>
-    <w:p>
-      <w:r>
-        <w:rPr>
-          <w:rFonts w:ascii="Aptos" w:hAnsi="Aptos"/>
-          <w:b/>
-          <w:color w:val="3174B6"/>
-          <w:sz w:val="34"/>
-        </w:rPr>
         <w:t>Access Matrix</w:t>
       </w:r>
     </w:p>
     <w:p>
-      <w:pPr>
-        <w:spacing w:after="80"/>
-      </w:pPr>
+      <w:pPr/>
       <w:r>
-        <w:rPr>
-          <w:rFonts w:ascii="Aptos" w:hAnsi="Aptos"/>
-          <w:sz w:val="22"/>
-        </w:rPr>
-        <w:t>Use this screen to inspect and edit role and permission rules.</w:t>
+        <w:t>Check the rule. Confirm the required permission, trust floor, and approval rules.</w:t>
       </w:r>
     </w:p>
     <w:p>
       <w:pPr>
-        <w:spacing w:after="80"/>
+        <w:pStyle w:val="Heading3"/>
       </w:pPr>
       <w:r>
-        <w:rPr>
-          <w:rFonts w:ascii="Aptos" w:hAnsi="Aptos"/>
-          <w:sz w:val="22"/>
-        </w:rPr>
-        <w:t>Choose a user, assign a role, grant a permission, review module access rules, or create a sample approval.</w:t>
-      </w:r>
-    </w:p>
-    <w:p>
-      <w:pPr>
-        <w:spacing w:after="80"/>
-      </w:pPr>
-      <w:r>
-        <w:rPr>
-          <w:rFonts w:ascii="Aptos" w:hAnsi="Aptos"/>
-          <w:sz w:val="22"/>
-        </w:rPr>
-        <w:t>Check whether the selected role has the needed permission, whether the module requires a trust floor, and whether the module requires approval for specific actions.</w:t>
-      </w:r>
-    </w:p>
-    <w:p>
-      <w:r>
-        <w:rPr>
-          <w:rFonts w:ascii="Aptos" w:hAnsi="Aptos"/>
-          <w:b/>
-          <w:color w:val="3174B6"/>
-          <w:sz w:val="34"/>
-        </w:rPr>
         <w:t>Device Onboarding</w:t>
       </w:r>
     </w:p>
     <w:p>
-      <w:pPr>
-        <w:spacing w:after="80"/>
-      </w:pPr>
+      <w:pPr/>
       <w:r>
-        <w:rPr>
-          <w:rFonts w:ascii="Aptos" w:hAnsi="Aptos"/>
-          <w:sz w:val="22"/>
-        </w:rPr>
-        <w:t>Use this screen when a new device needs to become trusted.</w:t>
+        <w:t>Use this when a new device needs to become trusted.</w:t>
       </w:r>
     </w:p>
     <w:p>
       <w:pPr>
-        <w:spacing w:after="80"/>
+        <w:pStyle w:val="Heading3"/>
       </w:pPr>
       <w:r>
-        <w:rPr>
-          <w:rFonts w:ascii="Aptos" w:hAnsi="Aptos"/>
-          <w:sz w:val="22"/>
-        </w:rPr>
-        <w:t>Start the onboarding wizard, choose a template, register a sample device, or review trust history.</w:t>
-      </w:r>
-    </w:p>
-    <w:p>
-      <w:pPr>
-        <w:spacing w:after="80"/>
-      </w:pPr>
-      <w:r>
-        <w:rPr>
-          <w:rFonts w:ascii="Aptos" w:hAnsi="Aptos"/>
-          <w:sz w:val="22"/>
-        </w:rPr>
-        <w:t>Check whether the device is registered, whether the trust level is high enough, and whether the device owner is correct.</w:t>
-      </w:r>
-    </w:p>
-    <w:p>
-      <w:r>
-        <w:rPr>
-          <w:rFonts w:ascii="Aptos" w:hAnsi="Aptos"/>
-          <w:b/>
-          <w:color w:val="3174B6"/>
-          <w:sz w:val="34"/>
-        </w:rPr>
         <w:t>Approval Queue</w:t>
       </w:r>
     </w:p>
     <w:p>
-      <w:pPr>
-        <w:spacing w:after="80"/>
-      </w:pPr>
+      <w:pPr/>
       <w:r>
-        <w:rPr>
-          <w:rFonts w:ascii="Aptos" w:hAnsi="Aptos"/>
-          <w:sz w:val="22"/>
-        </w:rPr>
-        <w:t>Use this screen when a request is valid but needs human review.</w:t>
+        <w:t>Use this when a valid action needs human review before it can continue.</w:t>
       </w:r>
     </w:p>
     <w:p>
       <w:pPr>
-        <w:spacing w:after="80"/>
+        <w:pStyle w:val="Heading3"/>
       </w:pPr>
       <w:r>
-        <w:rPr>
-          <w:rFonts w:ascii="Aptos" w:hAnsi="Aptos"/>
-          <w:sz w:val="22"/>
-        </w:rPr>
-        <w:t>Review pending requests, approve a request, deny a request, create a sample approval, or jump to the Access Matrix or Audit Log.</w:t>
-      </w:r>
-    </w:p>
-    <w:p>
-      <w:pPr>
-        <w:spacing w:after="80"/>
-      </w:pPr>
-      <w:r>
-        <w:rPr>
-          <w:rFonts w:ascii="Aptos" w:hAnsi="Aptos"/>
-          <w:sz w:val="22"/>
-        </w:rPr>
-        <w:t>Check requester, device, target module, action, risk level, and reason.</w:t>
-      </w:r>
-    </w:p>
-    <w:p>
-      <w:r>
-        <w:rPr>
-          <w:rFonts w:ascii="Aptos" w:hAnsi="Aptos"/>
-          <w:b/>
-          <w:color w:val="3174B6"/>
-          <w:sz w:val="34"/>
-        </w:rPr>
         <w:t>Audit Log</w:t>
       </w:r>
     </w:p>
     <w:p>
-      <w:pPr>
-        <w:spacing w:after="80"/>
-      </w:pPr>
+      <w:pPr/>
       <w:r>
-        <w:rPr>
-          <w:rFonts w:ascii="Aptos" w:hAnsi="Aptos"/>
-          <w:sz w:val="22"/>
-        </w:rPr>
-        <w:t>Use this screen to inspect the record of sensitive decisions.</w:t>
+        <w:t>Use this to verify what happened and why the system allowed, denied, or paused access.</w:t>
       </w:r>
     </w:p>
     <w:p>
       <w:pPr>
-        <w:spacing w:after="80"/>
+        <w:pStyle w:val="Heading2"/>
       </w:pPr>
       <w:r>
-        <w:rPr>
-          <w:rFonts w:ascii="Aptos" w:hAnsi="Aptos"/>
-          <w:sz w:val="22"/>
-        </w:rPr>
-        <w:t>View all access and approval events, open the latest audit event from the gate, and inspect allow and deny outcomes.</w:t>
+        <w:t>Full Treasury walkthrough</w:t>
       </w:r>
     </w:p>
     <w:p>
-      <w:pPr>
-        <w:spacing w:after="80"/>
-      </w:pPr>
+      <w:pPr/>
       <w:r>
-        <w:rPr>
-          <w:rFonts w:ascii="Aptos" w:hAnsi="Aptos"/>
-          <w:sz w:val="22"/>
-        </w:rPr>
-        <w:t>Check event type, actor, device, module, action, result, and reason.</w:t>
+        <w:t>Use this if you want the Treasury-only version with a tighter path.</w:t>
       </w:r>
     </w:p>
     <w:p>
+      <w:pPr>
+        <w:pStyle w:val="ListNumber"/>
+      </w:pPr>
       <w:r>
-        <w:rPr>
-          <w:rFonts w:ascii="Aptos" w:hAnsi="Aptos"/>
-          <w:b/>
-          <w:color w:val="3174B6"/>
-          <w:sz w:val="34"/>
-        </w:rPr>
-        <w:t>Using the access gate</w:t>
+        <w:t>Open the Dashboard Module Hub.</w:t>
       </w:r>
     </w:p>
     <w:p>
-      <w:pPr>
-        <w:spacing w:after="80"/>
-      </w:pPr>
+      <w:pPr/>
       <w:r>
-        <w:rPr>
-          <w:rFonts w:ascii="Aptos" w:hAnsi="Aptos"/>
-          <w:sz w:val="22"/>
-        </w:rPr>
-        <w:t>The gate is the entry point for sensitive surfaces.</w:t>
+        <w:t>Why this matters: this is the entry point where you first reach the control layer.</w:t>
       </w:r>
     </w:p>
     <w:p>
+      <w:pPr>
+        <w:pStyle w:val="ListNumber"/>
+      </w:pPr>
       <w:r>
-        <w:rPr>
-          <w:rFonts w:ascii="Aptos" w:hAnsi="Aptos"/>
-          <w:b/>
-          <w:color w:val="3174B6"/>
-          <w:sz w:val="34"/>
-        </w:rPr>
-        <w:t>Typical flow</w:t>
+        <w:t>Select `Users &amp; Devices Control`.</w:t>
       </w:r>
     </w:p>
     <w:p>
-      <w:pPr>
-        <w:spacing w:after="40"/>
-        <w:ind w:left="288" w:firstLine="0"/>
-      </w:pPr>
+      <w:pPr/>
       <w:r>
-        <w:rPr>
-          <w:rFonts w:ascii="Aptos" w:hAnsi="Aptos"/>
-          <w:sz w:val="22"/>
-        </w:rPr>
-        <w:t>Step 1: Open the Module Hub.</w:t>
+        <w:t>Why this matters: Treasury cannot be checked until the local registry is open.</w:t>
       </w:r>
     </w:p>
     <w:p>
       <w:pPr>
-        <w:spacing w:after="40"/>
-        <w:ind w:left="288" w:firstLine="0"/>
+        <w:pStyle w:val="ListNumber"/>
       </w:pPr>
       <w:r>
-        <w:rPr>
-          <w:rFonts w:ascii="Aptos" w:hAnsi="Aptos"/>
-          <w:sz w:val="22"/>
-        </w:rPr>
-        <w:t>Step 2: Select a sensitive module card.</w:t>
+        <w:t>Open `Users` and confirm the finance user is active.</w:t>
       </w:r>
     </w:p>
     <w:p>
-      <w:pPr>
-        <w:spacing w:after="40"/>
-        <w:ind w:left="288" w:firstLine="0"/>
-      </w:pPr>
+      <w:pPr/>
       <w:r>
-        <w:rPr>
-          <w:rFonts w:ascii="Aptos" w:hAnsi="Aptos"/>
-          <w:sz w:val="22"/>
-        </w:rPr>
-        <w:t>Step 3: Open the module route or the access gate.</w:t>
+        <w:t>Why this matters: the person has to exist and be active before finance access can work.</w:t>
       </w:r>
     </w:p>
     <w:p>
       <w:pPr>
-        <w:spacing w:after="40"/>
-        <w:ind w:left="288" w:firstLine="0"/>
+        <w:pStyle w:val="ListNumber"/>
       </w:pPr>
       <w:r>
-        <w:rPr>
-          <w:rFonts w:ascii="Aptos" w:hAnsi="Aptos"/>
-          <w:sz w:val="22"/>
-        </w:rPr>
-        <w:t>Step 4: Choose a local user.</w:t>
+        <w:t>Open `Devices` and confirm the device is trusted enough.</w:t>
       </w:r>
     </w:p>
     <w:p>
-      <w:pPr>
-        <w:spacing w:after="40"/>
-        <w:ind w:left="288" w:firstLine="0"/>
-      </w:pPr>
+      <w:pPr/>
       <w:r>
-        <w:rPr>
-          <w:rFonts w:ascii="Aptos" w:hAnsi="Aptos"/>
-          <w:sz w:val="22"/>
-        </w:rPr>
-        <w:t>Step 5: Choose a local device.</w:t>
+        <w:t>Why this matters: Treasury depends on device trust as well as user identity.</w:t>
       </w:r>
     </w:p>
     <w:p>
       <w:pPr>
-        <w:spacing w:after="40"/>
-        <w:ind w:left="288" w:firstLine="0"/>
+        <w:pStyle w:val="ListNumber"/>
       </w:pPr>
       <w:r>
-        <w:rPr>
-          <w:rFonts w:ascii="Aptos" w:hAnsi="Aptos"/>
-          <w:sz w:val="22"/>
-        </w:rPr>
-        <w:t>Step 6: Click Open screen.</w:t>
+        <w:t>Open `Access Matrix` and confirm Treasury needs the right permission and trust floor.</w:t>
       </w:r>
     </w:p>
     <w:p>
-      <w:pPr>
-        <w:spacing w:after="40"/>
-        <w:ind w:left="288" w:firstLine="0"/>
-      </w:pPr>
+      <w:pPr/>
       <w:r>
-        <w:rPr>
-          <w:rFonts w:ascii="Aptos" w:hAnsi="Aptos"/>
-          <w:sz w:val="22"/>
-        </w:rPr>
-        <w:t>Step 7: If the gate blocks access, read the Why blocked panel.</w:t>
+        <w:t>Why this matters: this tells you exactly what the gate will require.</w:t>
       </w:r>
     </w:p>
     <w:p>
       <w:pPr>
-        <w:spacing w:after="40"/>
-        <w:ind w:left="288" w:firstLine="0"/>
+        <w:pStyle w:val="ListNumber"/>
       </w:pPr>
       <w:r>
-        <w:rPr>
-          <w:rFonts w:ascii="Aptos" w:hAnsi="Aptos"/>
-          <w:sz w:val="22"/>
-        </w:rPr>
-        <w:t>Step 8: Fix the missing identity, trust, permission, or approval issue.</w:t>
+        <w:t>Open the Treasury gate.</w:t>
       </w:r>
     </w:p>
     <w:p>
-      <w:pPr>
-        <w:spacing w:after="40"/>
-        <w:ind w:left="288" w:firstLine="0"/>
-      </w:pPr>
+      <w:pPr/>
       <w:r>
-        <w:rPr>
-          <w:rFonts w:ascii="Aptos" w:hAnsi="Aptos"/>
-          <w:sz w:val="22"/>
-        </w:rPr>
-        <w:t>Step 9: Try again.</w:t>
+        <w:t>Why this matters: this is the actual allow/deny checkpoint.</w:t>
       </w:r>
     </w:p>
     <w:p>
+      <w:pPr>
+        <w:pStyle w:val="ListNumber"/>
+      </w:pPr>
       <w:r>
-        <w:rPr>
-          <w:rFonts w:ascii="Aptos" w:hAnsi="Aptos"/>
-          <w:b/>
-          <w:color w:val="3174B6"/>
-          <w:sz w:val="34"/>
-        </w:rPr>
-        <w:t>What the gate shows</w:t>
+        <w:t>Select the user and device.</w:t>
       </w:r>
     </w:p>
     <w:p>
-      <w:pPr>
-        <w:pStyle w:val="ListBullet"/>
-        <w:spacing w:after="40"/>
-      </w:pPr>
+      <w:pPr/>
       <w:r>
-        <w:rPr>
-          <w:rFonts w:ascii="Aptos" w:hAnsi="Aptos"/>
-          <w:sz w:val="22"/>
-        </w:rPr>
-        <w:t>the selected user</w:t>
+        <w:t>Why this matters: the gate uses both selections together.</w:t>
       </w:r>
     </w:p>
     <w:p>
       <w:pPr>
-        <w:pStyle w:val="ListBullet"/>
-        <w:spacing w:after="40"/>
+        <w:pStyle w:val="ListNumber"/>
       </w:pPr>
       <w:r>
-        <w:rPr>
-          <w:rFonts w:ascii="Aptos" w:hAnsi="Aptos"/>
-          <w:sz w:val="22"/>
-        </w:rPr>
-        <w:t>the selected device</w:t>
+        <w:t>Click `Open screen`.</w:t>
       </w:r>
     </w:p>
     <w:p>
-      <w:pPr>
-        <w:pStyle w:val="ListBullet"/>
-        <w:spacing w:after="40"/>
-      </w:pPr>
+      <w:pPr/>
       <w:r>
-        <w:rPr>
-          <w:rFonts w:ascii="Aptos" w:hAnsi="Aptos"/>
-          <w:sz w:val="22"/>
-        </w:rPr>
-        <w:t>the current status</w:t>
+        <w:t>Why this matters: this is the moment the gate decides whether to let Treasury open.</w:t>
       </w:r>
     </w:p>
     <w:p>
       <w:pPr>
-        <w:pStyle w:val="ListBullet"/>
-        <w:spacing w:after="40"/>
+        <w:pStyle w:val="ListNumber"/>
       </w:pPr>
       <w:r>
-        <w:rPr>
-          <w:rFonts w:ascii="Aptos" w:hAnsi="Aptos"/>
-          <w:sz w:val="22"/>
-        </w:rPr>
-        <w:t>the latest audit event</w:t>
+        <w:t>If blocked, read `Why blocked` and fix the missing identity, permission, trust, or approval.</w:t>
       </w:r>
     </w:p>
     <w:p>
-      <w:pPr>
-        <w:pStyle w:val="ListBullet"/>
-        <w:spacing w:after="40"/>
-      </w:pPr>
+      <w:pPr/>
       <w:r>
-        <w:rPr>
-          <w:rFonts w:ascii="Aptos" w:hAnsi="Aptos"/>
-          <w:sz w:val="22"/>
-        </w:rPr>
-        <w:t>the reason access was blocked</w:t>
+        <w:t>Why this matters: the block message points to the exact missing piece.</w:t>
       </w:r>
     </w:p>
     <w:p>
+      <w:pPr>
+        <w:pStyle w:val="ListNumber"/>
+      </w:pPr>
       <w:r>
-        <w:rPr>
-          <w:rFonts w:ascii="Aptos" w:hAnsi="Aptos"/>
-          <w:b/>
-          <w:color w:val="3174B6"/>
-          <w:sz w:val="34"/>
-        </w:rPr>
-        <w:t>Common blocked reasons</w:t>
+        <w:t>If approval is needed, review `Approval Queue`, approve or deny it, then try again.</w:t>
       </w:r>
     </w:p>
     <w:p>
-      <w:pPr>
-        <w:pStyle w:val="ListBullet"/>
-        <w:spacing w:after="40"/>
-      </w:pPr>
+      <w:pPr/>
       <w:r>
-        <w:rPr>
-          <w:rFonts w:ascii="Aptos" w:hAnsi="Aptos"/>
-          <w:sz w:val="22"/>
-        </w:rPr>
-        <w:t>unknown user</w:t>
+        <w:t>Why this matters: sensitive actions should pause for a human decision.</w:t>
       </w:r>
     </w:p>
     <w:p>
       <w:pPr>
-        <w:pStyle w:val="ListBullet"/>
-        <w:spacing w:after="40"/>
+        <w:pStyle w:val="ListNumber"/>
       </w:pPr>
       <w:r>
-        <w:rPr>
-          <w:rFonts w:ascii="Aptos" w:hAnsi="Aptos"/>
-          <w:sz w:val="22"/>
-        </w:rPr>
-        <w:t>unknown device</w:t>
+        <w:t>Open `Audit Log` and confirm the decision was recorded.</w:t>
       </w:r>
     </w:p>
     <w:p>
-      <w:pPr>
-        <w:pStyle w:val="ListBullet"/>
-        <w:spacing w:after="40"/>
-      </w:pPr>
+      <w:pPr/>
       <w:r>
-        <w:rPr>
-          <w:rFonts w:ascii="Aptos" w:hAnsi="Aptos"/>
-          <w:sz w:val="22"/>
-        </w:rPr>
-        <w:t>archived user</w:t>
+        <w:t>Why this matters: the audit trail proves what happened and why.</w:t>
       </w:r>
     </w:p>
     <w:p>
       <w:pPr>
-        <w:pStyle w:val="ListBullet"/>
-        <w:spacing w:after="40"/>
+        <w:pStyle w:val="Heading2"/>
       </w:pPr>
       <w:r>
-        <w:rPr>
-          <w:rFonts w:ascii="Aptos" w:hAnsi="Aptos"/>
-          <w:sz w:val="22"/>
-        </w:rPr>
-        <w:t>blocked device</w:t>
-      </w:r>
-    </w:p>
-    <w:p>
-      <w:pPr>
-        <w:pStyle w:val="ListBullet"/>
-        <w:spacing w:after="40"/>
-      </w:pPr>
-      <w:r>
-        <w:rPr>
-          <w:rFonts w:ascii="Aptos" w:hAnsi="Aptos"/>
-          <w:sz w:val="22"/>
-        </w:rPr>
-        <w:t>device trust too low</w:t>
-      </w:r>
-    </w:p>
-    <w:p>
-      <w:pPr>
-        <w:pStyle w:val="ListBullet"/>
-        <w:spacing w:after="40"/>
-      </w:pPr>
-      <w:r>
-        <w:rPr>
-          <w:rFonts w:ascii="Aptos" w:hAnsi="Aptos"/>
-          <w:sz w:val="22"/>
-        </w:rPr>
-        <w:t>missing required permission</w:t>
-      </w:r>
-    </w:p>
-    <w:p>
-      <w:pPr>
-        <w:pStyle w:val="ListBullet"/>
-        <w:spacing w:after="40"/>
-      </w:pPr>
-      <w:r>
-        <w:rPr>
-          <w:rFonts w:ascii="Aptos" w:hAnsi="Aptos"/>
-          <w:sz w:val="22"/>
-        </w:rPr>
-        <w:t>approval required</w:t>
-      </w:r>
-    </w:p>
-    <w:p>
-      <w:r>
-        <w:rPr>
-          <w:rFonts w:ascii="Aptos" w:hAnsi="Aptos"/>
-          <w:b/>
-          <w:color w:val="3174B6"/>
-          <w:sz w:val="34"/>
-        </w:rPr>
-        <w:t>Sample actions</w:t>
-      </w:r>
-    </w:p>
-    <w:p>
-      <w:pPr>
-        <w:spacing w:after="80"/>
-      </w:pPr>
-      <w:r>
-        <w:rPr>
-          <w:rFonts w:ascii="Aptos" w:hAnsi="Aptos"/>
-          <w:sz w:val="22"/>
-        </w:rPr>
-        <w:t>The module includes sample buttons so you can test the system quickly.</w:t>
-      </w:r>
-    </w:p>
-    <w:p>
-      <w:pPr>
-        <w:spacing w:after="80"/>
-      </w:pPr>
-      <w:r>
-        <w:rPr>
-          <w:rFonts w:ascii="Aptos" w:hAnsi="Aptos"/>
-          <w:sz w:val="22"/>
-        </w:rPr>
-        <w:t>Common sample actions:</w:t>
-      </w:r>
-    </w:p>
-    <w:p>
-      <w:pPr>
-        <w:pStyle w:val="ListBullet"/>
-        <w:spacing w:after="40"/>
-      </w:pPr>
-      <w:r>
-        <w:rPr>
-          <w:rFonts w:ascii="Aptos" w:hAnsi="Aptos"/>
-          <w:sz w:val="22"/>
-        </w:rPr>
-        <w:t>Register user</w:t>
-      </w:r>
-    </w:p>
-    <w:p>
-      <w:pPr>
-        <w:pStyle w:val="ListBullet"/>
-        <w:spacing w:after="40"/>
-      </w:pPr>
-      <w:r>
-        <w:rPr>
-          <w:rFonts w:ascii="Aptos" w:hAnsi="Aptos"/>
-          <w:sz w:val="22"/>
-        </w:rPr>
-        <w:t>Register device</w:t>
-      </w:r>
-    </w:p>
-    <w:p>
-      <w:pPr>
-        <w:pStyle w:val="ListBullet"/>
-        <w:spacing w:after="40"/>
-      </w:pPr>
-      <w:r>
-        <w:rPr>
-          <w:rFonts w:ascii="Aptos" w:hAnsi="Aptos"/>
-          <w:sz w:val="22"/>
-        </w:rPr>
-        <w:t>Create approval</w:t>
-      </w:r>
-    </w:p>
-    <w:p>
-      <w:pPr>
-        <w:pStyle w:val="ListBullet"/>
-        <w:spacing w:after="40"/>
-      </w:pPr>
-      <w:r>
-        <w:rPr>
-          <w:rFonts w:ascii="Aptos" w:hAnsi="Aptos"/>
-          <w:sz w:val="22"/>
-        </w:rPr>
-        <w:t>Open Security Lock</w:t>
-      </w:r>
-    </w:p>
-    <w:p>
-      <w:pPr>
-        <w:pStyle w:val="ListBullet"/>
-        <w:spacing w:after="40"/>
-      </w:pPr>
-      <w:r>
-        <w:rPr>
-          <w:rFonts w:ascii="Aptos" w:hAnsi="Aptos"/>
-          <w:sz w:val="22"/>
-        </w:rPr>
-        <w:t>Open latest audit</w:t>
-      </w:r>
-    </w:p>
-    <w:p>
-      <w:pPr>
-        <w:pStyle w:val="ListBullet"/>
-        <w:spacing w:after="40"/>
-      </w:pPr>
-      <w:r>
-        <w:rPr>
-          <w:rFonts w:ascii="Aptos" w:hAnsi="Aptos"/>
-          <w:sz w:val="22"/>
-        </w:rPr>
-        <w:t>View latest audit</w:t>
-      </w:r>
-    </w:p>
-    <w:p>
-      <w:pPr>
-        <w:spacing w:after="80"/>
-      </w:pPr>
-      <w:r>
-        <w:rPr>
-          <w:rFonts w:ascii="Aptos" w:hAnsi="Aptos"/>
-          <w:sz w:val="22"/>
-        </w:rPr>
-        <w:t>These are useful when you want to test the flow end to end without hand-building every record.</w:t>
-      </w:r>
-    </w:p>
-    <w:p>
-      <w:r>
-        <w:rPr>
-          <w:rFonts w:ascii="Aptos" w:hAnsi="Aptos"/>
-          <w:b/>
-          <w:color w:val="3174B6"/>
-          <w:sz w:val="34"/>
-        </w:rPr>
-        <w:t>Local data behavior</w:t>
-      </w:r>
-    </w:p>
-    <w:p>
-      <w:pPr>
-        <w:spacing w:after="80"/>
-      </w:pPr>
-      <w:r>
-        <w:rPr>
-          <w:rFonts w:ascii="Aptos" w:hAnsi="Aptos"/>
-          <w:sz w:val="22"/>
-        </w:rPr>
-        <w:t>The module uses local data only.</w:t>
-      </w:r>
-    </w:p>
-    <w:p>
-      <w:pPr>
-        <w:spacing w:after="80"/>
-      </w:pPr>
-      <w:r>
-        <w:rPr>
-          <w:rFonts w:ascii="Aptos" w:hAnsi="Aptos"/>
-          <w:sz w:val="22"/>
-        </w:rPr>
-        <w:t>How it works:</w:t>
-      </w:r>
-    </w:p>
-    <w:p>
-      <w:pPr>
-        <w:pStyle w:val="ListBullet"/>
-        <w:spacing w:after="40"/>
-      </w:pPr>
-      <w:r>
-        <w:rPr>
-          <w:rFonts w:ascii="Aptos" w:hAnsi="Aptos"/>
-          <w:sz w:val="22"/>
-        </w:rPr>
-        <w:t>The module starts with JSON seed files.</w:t>
-      </w:r>
-    </w:p>
-    <w:p>
-      <w:pPr>
-        <w:pStyle w:val="ListBullet"/>
-        <w:spacing w:after="40"/>
-      </w:pPr>
-      <w:r>
-        <w:rPr>
-          <w:rFonts w:ascii="Aptos" w:hAnsi="Aptos"/>
-          <w:sz w:val="22"/>
-        </w:rPr>
-        <w:t>Live users, devices, approvals, audit events, roles, permissions, trust levels, and access rules are stored locally.</w:t>
-      </w:r>
-    </w:p>
-    <w:p>
-      <w:pPr>
-        <w:pStyle w:val="ListBullet"/>
-        <w:spacing w:after="40"/>
-      </w:pPr>
-      <w:r>
-        <w:rPr>
-          <w:rFonts w:ascii="Aptos" w:hAnsi="Aptos"/>
-          <w:sz w:val="22"/>
-        </w:rPr>
-        <w:t>The app keeps the data on the device.</w:t>
-      </w:r>
-    </w:p>
-    <w:p>
-      <w:pPr>
-        <w:pStyle w:val="ListBullet"/>
-        <w:spacing w:after="40"/>
-      </w:pPr>
-      <w:r>
-        <w:rPr>
-          <w:rFonts w:ascii="Aptos" w:hAnsi="Aptos"/>
-          <w:sz w:val="22"/>
-        </w:rPr>
-        <w:t>No cloud login is required.</w:t>
-      </w:r>
-    </w:p>
-    <w:p>
-      <w:r>
-        <w:rPr>
-          <w:rFonts w:ascii="Aptos" w:hAnsi="Aptos"/>
-          <w:b/>
-          <w:color w:val="3174B6"/>
-          <w:sz w:val="34"/>
-        </w:rPr>
-        <w:t>Recommended daily use</w:t>
-      </w:r>
-    </w:p>
-    <w:p>
-      <w:pPr>
-        <w:spacing w:after="40"/>
-        <w:ind w:left="288" w:firstLine="0"/>
-      </w:pPr>
-      <w:r>
-        <w:rPr>
-          <w:rFonts w:ascii="Aptos" w:hAnsi="Aptos"/>
-          <w:sz w:val="22"/>
-        </w:rPr>
-        <w:t>Step 1: Open Users and confirm the identity exists.</w:t>
-      </w:r>
-    </w:p>
-    <w:p>
-      <w:pPr>
-        <w:spacing w:after="40"/>
-        <w:ind w:left="288" w:firstLine="0"/>
-      </w:pPr>
-      <w:r>
-        <w:rPr>
-          <w:rFonts w:ascii="Aptos" w:hAnsi="Aptos"/>
-          <w:sz w:val="22"/>
-        </w:rPr>
-        <w:t>Step 2: Open Devices and confirm the device is trusted.</w:t>
-      </w:r>
-    </w:p>
-    <w:p>
-      <w:pPr>
-        <w:spacing w:after="40"/>
-        <w:ind w:left="288" w:firstLine="0"/>
-      </w:pPr>
-      <w:r>
-        <w:rPr>
-          <w:rFonts w:ascii="Aptos" w:hAnsi="Aptos"/>
-          <w:sz w:val="22"/>
-        </w:rPr>
-        <w:t>Step 3: Open Access Matrix and confirm the role has the required permission.</w:t>
-      </w:r>
-    </w:p>
-    <w:p>
-      <w:pPr>
-        <w:spacing w:after="40"/>
-        <w:ind w:left="288" w:firstLine="0"/>
-      </w:pPr>
-      <w:r>
-        <w:rPr>
-          <w:rFonts w:ascii="Aptos" w:hAnsi="Aptos"/>
-          <w:sz w:val="22"/>
-        </w:rPr>
-        <w:t>Step 4: Open Device Onboarding if trust needs to be raised.</w:t>
-      </w:r>
-    </w:p>
-    <w:p>
-      <w:pPr>
-        <w:spacing w:after="40"/>
-        <w:ind w:left="288" w:firstLine="0"/>
-      </w:pPr>
-      <w:r>
-        <w:rPr>
-          <w:rFonts w:ascii="Aptos" w:hAnsi="Aptos"/>
-          <w:sz w:val="22"/>
-        </w:rPr>
-        <w:t>Step 5: Use Approval Queue for higher-risk actions.</w:t>
-      </w:r>
-    </w:p>
-    <w:p>
-      <w:pPr>
-        <w:spacing w:after="40"/>
-        <w:ind w:left="288" w:firstLine="0"/>
-      </w:pPr>
-      <w:r>
-        <w:rPr>
-          <w:rFonts w:ascii="Aptos" w:hAnsi="Aptos"/>
-          <w:sz w:val="22"/>
-        </w:rPr>
-        <w:t>Step 6: Check Audit Log whenever you need a trail of what happened.</w:t>
-      </w:r>
-    </w:p>
-    <w:p>
-      <w:r>
-        <w:rPr>
-          <w:rFonts w:ascii="Aptos" w:hAnsi="Aptos"/>
-          <w:b/>
-          <w:color w:val="3174B6"/>
-          <w:sz w:val="34"/>
-        </w:rPr>
-        <w:t>Security reminders</w:t>
-      </w:r>
-    </w:p>
-    <w:p>
-      <w:pPr>
-        <w:pStyle w:val="ListBullet"/>
-        <w:spacing w:after="40"/>
-      </w:pPr>
-      <w:r>
-        <w:rPr>
-          <w:rFonts w:ascii="Aptos" w:hAnsi="Aptos"/>
-          <w:sz w:val="22"/>
-        </w:rPr>
-        <w:t>Never assume a device is trusted just because it exists.</w:t>
-      </w:r>
-    </w:p>
-    <w:p>
-      <w:pPr>
-        <w:pStyle w:val="ListBullet"/>
-        <w:spacing w:after="40"/>
-      </w:pPr>
-      <w:r>
-        <w:rPr>
-          <w:rFonts w:ascii="Aptos" w:hAnsi="Aptos"/>
-          <w:sz w:val="22"/>
-        </w:rPr>
-        <w:t>Never assume a role is enough without the permission.</w:t>
-      </w:r>
-    </w:p>
-    <w:p>
-      <w:pPr>
-        <w:pStyle w:val="ListBullet"/>
-        <w:spacing w:after="40"/>
-      </w:pPr>
-      <w:r>
-        <w:rPr>
-          <w:rFonts w:ascii="Aptos" w:hAnsi="Aptos"/>
-          <w:sz w:val="22"/>
-        </w:rPr>
-        <w:t>Never skip the audit trail.</w:t>
-      </w:r>
-    </w:p>
-    <w:p>
-      <w:pPr>
-        <w:pStyle w:val="ListBullet"/>
-        <w:spacing w:after="40"/>
-      </w:pPr>
-      <w:r>
-        <w:rPr>
-          <w:rFonts w:ascii="Aptos" w:hAnsi="Aptos"/>
-          <w:sz w:val="22"/>
-        </w:rPr>
-        <w:t>Use approvals for actions that are risky or sensitive.</w:t>
-      </w:r>
-    </w:p>
-    <w:p>
-      <w:r>
-        <w:rPr>
-          <w:rFonts w:ascii="Aptos" w:hAnsi="Aptos"/>
-          <w:b/>
-          <w:color w:val="3174B6"/>
-          <w:sz w:val="34"/>
-        </w:rPr>
         <w:t>If something looks wrong</w:t>
       </w:r>
     </w:p>
     <w:p>
-      <w:pPr>
-        <w:spacing w:after="80"/>
-      </w:pPr>
+      <w:pPr/>
       <w:r>
-        <w:rPr>
-          <w:rFonts w:ascii="Aptos" w:hAnsi="Aptos"/>
-          <w:sz w:val="22"/>
-        </w:rPr>
         <w:t>Check these first:</w:t>
       </w:r>
     </w:p>
     <w:p>
       <w:pPr>
         <w:pStyle w:val="ListBullet"/>
-        <w:spacing w:after="40"/>
       </w:pPr>
       <w:r>
-        <w:rPr>
-          <w:rFonts w:ascii="Aptos" w:hAnsi="Aptos"/>
-          <w:sz w:val="22"/>
-        </w:rPr>
         <w:t>Is the selected user archived?</w:t>
       </w:r>
     </w:p>
     <w:p>
       <w:pPr>
         <w:pStyle w:val="ListBullet"/>
-        <w:spacing w:after="40"/>
       </w:pPr>
       <w:r>
-        <w:rPr>
-          <w:rFonts w:ascii="Aptos" w:hAnsi="Aptos"/>
-          <w:sz w:val="22"/>
-        </w:rPr>
         <w:t>Is the selected device blocked or low trust?</w:t>
       </w:r>
     </w:p>
     <w:p>
       <w:pPr>
         <w:pStyle w:val="ListBullet"/>
-        <w:spacing w:after="40"/>
       </w:pPr>
       <w:r>
-        <w:rPr>
-          <w:rFonts w:ascii="Aptos" w:hAnsi="Aptos"/>
-          <w:sz w:val="22"/>
-        </w:rPr>
         <w:t>Does the role have the right permission?</w:t>
       </w:r>
     </w:p>
     <w:p>
       <w:pPr>
         <w:pStyle w:val="ListBullet"/>
-        <w:spacing w:after="40"/>
       </w:pPr>
       <w:r>
-        <w:rPr>
-          <w:rFonts w:ascii="Aptos" w:hAnsi="Aptos"/>
-          <w:sz w:val="22"/>
-        </w:rPr>
         <w:t>Is the action waiting for approval?</w:t>
       </w:r>
     </w:p>
     <w:p>
       <w:pPr>
         <w:pStyle w:val="ListBullet"/>
-        <w:spacing w:after="40"/>
       </w:pPr>
       <w:r>
-        <w:rPr>
-          <w:rFonts w:ascii="Aptos" w:hAnsi="Aptos"/>
-          <w:sz w:val="22"/>
-        </w:rPr>
         <w:t>Did the gate write an audit event?</w:t>
       </w:r>
     </w:p>
     <w:p>
       <w:pPr>
-        <w:spacing w:after="80"/>
+        <w:pStyle w:val="Heading2"/>
       </w:pPr>
       <w:r>
-        <w:rPr>
-          <w:rFonts w:ascii="Aptos" w:hAnsi="Aptos"/>
-          <w:sz w:val="22"/>
-        </w:rPr>
-        <w:t>If the module still feels incomplete, open the Security Lock screen and verify the selected local context there.</w:t>
+        <w:t>Common mistakes</w:t>
+      </w:r>
+    </w:p>
+    <w:p>
+      <w:pPr/>
+      <w:r>
+        <w:t>These are the most common reasons a test does not behave as expected.</w:t>
+      </w:r>
+    </w:p>
+    <w:p>
+      <w:pPr>
+        <w:pStyle w:val="ListBullet"/>
+      </w:pPr>
+      <w:r>
+        <w:t>You clicked `Open screen` before selecting both the user and the device.</w:t>
+      </w:r>
+    </w:p>
+    <w:p>
+      <w:pPr>
+        <w:pStyle w:val="ListBullet"/>
+      </w:pPr>
+      <w:r>
+        <w:t>You used a low-trust device for the Treasury path.</w:t>
+      </w:r>
+    </w:p>
+    <w:p>
+      <w:pPr>
+        <w:pStyle w:val="ListBullet"/>
+      </w:pPr>
+      <w:r>
+        <w:t>You tested a user that does not have finance permissions.</w:t>
+      </w:r>
+    </w:p>
+    <w:p>
+      <w:pPr>
+        <w:pStyle w:val="ListBullet"/>
+      </w:pPr>
+      <w:r>
+        <w:t>You forgot to reset the demo data after changing the seed state.</w:t>
+      </w:r>
+    </w:p>
+    <w:p>
+      <w:pPr>
+        <w:pStyle w:val="ListBullet"/>
+      </w:pPr>
+      <w:r>
+        <w:t>You looked for the approval result before processing the request in `Approval Queue`.</w:t>
+      </w:r>
+    </w:p>
+    <w:p>
+      <w:pPr>
+        <w:pStyle w:val="ListBullet"/>
+      </w:pPr>
+      <w:r>
+        <w:t>You expected the audit log to change before the action was actually allowed or denied.</w:t>
+      </w:r>
+    </w:p>
+    <w:p>
+      <w:pPr>
+        <w:pStyle w:val="ListBullet"/>
+      </w:pPr>
+      <w:r>
+        <w:t>You seeded a new item but did not refresh or re-open the relevant screen.</w:t>
+      </w:r>
+    </w:p>
+    <w:p>
+      <w:pPr>
+        <w:pStyle w:val="Heading2"/>
+      </w:pPr>
+      <w:r>
+        <w:t>Safe habit</w:t>
+      </w:r>
+    </w:p>
+    <w:p>
+      <w:pPr/>
+      <w:r>
+        <w:t>For Treasury, always check:</w:t>
+      </w:r>
+    </w:p>
+    <w:p>
+      <w:pPr>
+        <w:pStyle w:val="ListNumber"/>
+      </w:pPr>
+      <w:r>
+        <w:t>the person</w:t>
+      </w:r>
+    </w:p>
+    <w:p>
+      <w:pPr>
+        <w:pStyle w:val="ListNumber"/>
+      </w:pPr>
+      <w:r>
+        <w:t>the device</w:t>
+      </w:r>
+    </w:p>
+    <w:p>
+      <w:pPr>
+        <w:pStyle w:val="ListNumber"/>
+      </w:pPr>
+      <w:r>
+        <w:t>the permission</w:t>
+      </w:r>
+    </w:p>
+    <w:p>
+      <w:pPr>
+        <w:pStyle w:val="ListNumber"/>
+      </w:pPr>
+      <w:r>
+        <w:t>the trust floor</w:t>
+      </w:r>
+    </w:p>
+    <w:p>
+      <w:pPr>
+        <w:pStyle w:val="ListNumber"/>
+      </w:pPr>
+      <w:r>
+        <w:t>whether the action needs approval</w:t>
+      </w:r>
+    </w:p>
+    <w:p>
+      <w:pPr>
+        <w:pStyle w:val="ListNumber"/>
+      </w:pPr>
+      <w:r>
+        <w:t>the audit trail</w:t>
       </w:r>
     </w:p>
     <w:sectPr>
-      <w:footerReference w:type="default" r:id="rId9"/>
       <w:pgSz w:w="12240" w:h="15840"/>
-      <w:pgMar w:top="1224" w:right="1224" w:bottom="1008" w:left="1224" w:header="720" w:footer="720" w:gutter="0"/>
+      <w:pgMar w:top="1440" w:right="1440" w:bottom="1440" w:left="1440" w:header="708" w:footer="708" w:gutter="0"/>
       <w:cols w:space="720"/>
       <w:docGrid w:linePitch="360"/>
     </w:sectPr>
   </w:body>
 </w:document>
-</file>
-
-<file path=word/footer1.xml><?xml version="1.0" encoding="utf-8"?>
-<w:ftr xmlns:m="http://schemas.openxmlformats.org/officeDocument/2006/math" xmlns:mc="http://schemas.openxmlformats.org/markup-compatibility/2006" xmlns:mo="http://schemas.microsoft.com/office/mac/office/2008/main" xmlns:mv="urn:schemas-microsoft-com:mac:vml" xmlns:o="urn:schemas-microsoft-com:office:office" xmlns:r="http://schemas.openxmlformats.org/officeDocument/2006/relationships" xmlns:v="urn:schemas-microsoft-com:vml" xmlns:w10="urn:schemas-microsoft-com:office:word" xmlns:w14="http://schemas.microsoft.com/office/word/2010/wordml" xmlns:w="http://schemas.openxmlformats.org/wordprocessingml/2006/main" xmlns:wne="http://schemas.microsoft.com/office/word/2006/wordml" xmlns:wp14="http://schemas.microsoft.com/office/word/2010/wordprocessingDrawing" xmlns:wp="http://schemas.openxmlformats.org/drawingml/2006/wordprocessingDrawing" xmlns:wpc="http://schemas.microsoft.com/office/word/2010/wordprocessingCanvas" xmlns:wpg="http://schemas.microsoft.com/office/word/2010/wordprocessingGroup" xmlns:wpi="http://schemas.microsoft.com/office/word/2010/wordprocessingInk" xmlns:wps="http://schemas.microsoft.com/office/word/2010/wordprocessingShape" mc:Ignorable="w14 wp14">
-  <w:p>
-    <w:pPr>
-      <w:pStyle w:val="Footer"/>
-      <w:jc w:val="right"/>
-    </w:pPr>
-    <w:r>
-      <w:rPr>
-        <w:rFonts w:ascii="Aptos" w:hAnsi="Aptos"/>
-        <w:color w:val="555555"/>
-        <w:sz w:val="18"/>
-      </w:rPr>
-      <w:t>Users &amp; Devices Control User Guide</w:t>
-    </w:r>
-  </w:p>
-</w:ftr>
 </file>
 
 <file path=word/numbering.xml><?xml version="1.0" encoding="utf-8"?>
@@ -1714,8 +2352,12 @@
     <w:name w:val="Normal"/>
     <w:qFormat/>
     <w:rsid w:val="00FC693F"/>
+    <w:pPr>
+      <w:spacing w:after="100" w:line="288" w:lineRule="auto"/>
+    </w:pPr>
     <w:rPr>
-      <w:rFonts w:ascii="Aptos" w:hAnsi="Aptos"/>
+      <w:rFonts w:ascii="Calibri" w:hAnsi="Calibri"/>
+      <w:color w:val="000000"/>
       <w:sz w:val="22"/>
     </w:rPr>
   </w:style>
@@ -1774,15 +2416,15 @@
     <w:pPr>
       <w:keepNext/>
       <w:keepLines/>
-      <w:spacing w:before="480" w:after="0"/>
+      <w:spacing w:before="320" w:after="160"/>
       <w:outlineLvl w:val="0"/>
     </w:pPr>
     <w:rPr>
-      <w:rFonts w:asciiTheme="majorHAnsi" w:eastAsiaTheme="majorEastAsia" w:hAnsiTheme="majorHAnsi" w:cstheme="majorBidi" w:ascii="Aptos" w:hAnsi="Aptos"/>
+      <w:rFonts w:asciiTheme="majorHAnsi" w:eastAsiaTheme="majorEastAsia" w:hAnsiTheme="majorHAnsi" w:cstheme="majorBidi" w:ascii="Calibri" w:hAnsi="Calibri"/>
       <w:b/>
       <w:bCs/>
-      <w:color w:val="365F91" w:themeColor="accent1" w:themeShade="BF"/>
-      <w:sz w:val="28"/>
+      <w:color w:val="2E74B5"/>
+      <w:sz w:val="32"/>
       <w:szCs w:val="28"/>
     </w:rPr>
   </w:style>
@@ -1798,14 +2440,14 @@
     <w:pPr>
       <w:keepNext/>
       <w:keepLines/>
-      <w:spacing w:before="200" w:after="0"/>
+      <w:spacing w:before="240" w:after="120"/>
       <w:outlineLvl w:val="1"/>
     </w:pPr>
     <w:rPr>
-      <w:rFonts w:asciiTheme="majorHAnsi" w:eastAsiaTheme="majorEastAsia" w:hAnsiTheme="majorHAnsi" w:cstheme="majorBidi" w:ascii="Aptos" w:hAnsi="Aptos"/>
+      <w:rFonts w:asciiTheme="majorHAnsi" w:eastAsiaTheme="majorEastAsia" w:hAnsiTheme="majorHAnsi" w:cstheme="majorBidi" w:ascii="Calibri" w:hAnsi="Calibri"/>
       <w:b/>
       <w:bCs/>
-      <w:color w:val="4F81BD" w:themeColor="accent1"/>
+      <w:color w:val="2E74B5"/>
       <w:sz w:val="26"/>
       <w:szCs w:val="26"/>
     </w:rPr>
@@ -1822,14 +2464,15 @@
     <w:pPr>
       <w:keepNext/>
       <w:keepLines/>
-      <w:spacing w:before="200" w:after="0"/>
+      <w:spacing w:before="160" w:after="80"/>
       <w:outlineLvl w:val="2"/>
     </w:pPr>
     <w:rPr>
-      <w:rFonts w:asciiTheme="majorHAnsi" w:eastAsiaTheme="majorEastAsia" w:hAnsiTheme="majorHAnsi" w:cstheme="majorBidi"/>
+      <w:rFonts w:asciiTheme="majorHAnsi" w:eastAsiaTheme="majorEastAsia" w:hAnsiTheme="majorHAnsi" w:cstheme="majorBidi" w:ascii="Calibri" w:hAnsi="Calibri"/>
       <w:b/>
       <w:bCs/>
-      <w:color w:val="4F81BD" w:themeColor="accent1"/>
+      <w:color w:val="1F4D78"/>
+      <w:sz w:val="24"/>
     </w:rPr>
   </w:style>
   <w:style w:type="paragraph" w:styleId="Heading4">
@@ -2067,7 +2710,7 @@
       <w:contextualSpacing/>
     </w:pPr>
     <w:rPr>
-      <w:rFonts w:asciiTheme="majorHAnsi" w:eastAsiaTheme="majorEastAsia" w:hAnsiTheme="majorHAnsi" w:cstheme="majorBidi" w:ascii="Aptos" w:hAnsi="Aptos"/>
+      <w:rFonts w:asciiTheme="majorHAnsi" w:eastAsiaTheme="majorEastAsia" w:hAnsiTheme="majorHAnsi" w:cstheme="majorBidi"/>
       <w:color w:val="17365D" w:themeColor="text2" w:themeShade="BF"/>
       <w:spacing w:val="5"/>
       <w:kern w:val="28"/>
@@ -2245,8 +2888,13 @@
       <w:numPr>
         <w:numId w:val="1"/>
       </w:numPr>
+      <w:spacing w:after="40" w:line="264" w:lineRule="auto"/>
       <w:contextualSpacing/>
     </w:pPr>
+    <w:rPr>
+      <w:rFonts w:ascii="Calibri" w:hAnsi="Calibri"/>
+      <w:sz w:val="22"/>
+    </w:rPr>
   </w:style>
   <w:style w:type="paragraph" w:styleId="ListBullet2">
     <w:name w:val="List Bullet 2"/>
@@ -2284,8 +2932,13 @@
       <w:numPr>
         <w:numId w:val="5"/>
       </w:numPr>
+      <w:spacing w:after="40" w:line="264" w:lineRule="auto"/>
       <w:contextualSpacing/>
     </w:pPr>
+    <w:rPr>
+      <w:rFonts w:ascii="Calibri" w:hAnsi="Calibri"/>
+      <w:sz w:val="22"/>
+    </w:rPr>
   </w:style>
   <w:style w:type="paragraph" w:styleId="ListNumber2">
     <w:name w:val="List Number 2"/>

</xml_diff>

<commit_message>
Add local security session and startup gate
</commit_message>
<xml_diff>
--- a/modules/01_USERS_AND_DEVICES_CONTROL/docs/USER_GUIDE.docx
+++ b/modules/01_USERS_AND_DEVICES_CONTROL/docs/USER_GUIDE.docx
@@ -272,7 +272,7 @@
     <w:p>
       <w:pPr/>
       <w:r>
-        <w:t>If anything is missing, the gate should explain what is missing and why.</w:t>
+        <w:t>If anything is missing, the gate should explain what is missing and why. The startup lock is the first check. The voice gate is optional and should only be used when you want the headset readiness step at startup. A small opaque security session box now sits in the top-left corner of the desktop shell. It shows whether the session is active, the active user, whether that user is online, the timeout window, and a live countdown to expiry. You can tap it to return to Security Lock or jump to Access Matrix.</w:t>
       </w:r>
     </w:p>
     <w:p>
@@ -388,6 +388,118 @@
     <w:p>
       <w:pPr/>
       <w:r>
+        <w:t>6. Use the top-left session box to check the live countdown, active user, and online status during testing.</w:t>
+      </w:r>
+    </w:p>
+    <w:p>
+      <w:pPr>
+        <w:pStyle w:val="ListBullet"/>
+      </w:pPr>
+      <w:r>
+        <w:t>adds a sample user record</w:t>
+      </w:r>
+    </w:p>
+    <w:p>
+      <w:pPr>
+        <w:pStyle w:val="ListBullet"/>
+      </w:pPr>
+      <w:r>
+        <w:t>gives you a user you can inspect in `Users`</w:t>
+      </w:r>
+    </w:p>
+    <w:p>
+      <w:pPr>
+        <w:pStyle w:val="ListBullet"/>
+      </w:pPr>
+      <w:r>
+        <w:t>helps you test the permission side of access</w:t>
+      </w:r>
+    </w:p>
+    <w:p>
+      <w:pPr/>
+      <w:r>
+        <w:t>When to use it:</w:t>
+      </w:r>
+    </w:p>
+    <w:p>
+      <w:pPr>
+        <w:pStyle w:val="ListBullet"/>
+      </w:pPr>
+      <w:r>
+        <w:t>you want to test a blocked or allowed user path</w:t>
+      </w:r>
+    </w:p>
+    <w:p>
+      <w:pPr>
+        <w:pStyle w:val="ListBullet"/>
+      </w:pPr>
+      <w:r>
+        <w:t>you want to compare a finance user with a lighter user</w:t>
+      </w:r>
+    </w:p>
+    <w:p>
+      <w:pPr>
+        <w:pStyle w:val="ListBullet"/>
+      </w:pPr>
+      <w:r>
+        <w:t>you want to reset the flow without creating a custom person first</w:t>
+      </w:r>
+    </w:p>
+    <w:p>
+      <w:pPr/>
+      <w:r>
+        <w:t>Click-by-click:</w:t>
+      </w:r>
+    </w:p>
+    <w:p>
+      <w:pPr>
+        <w:pStyle w:val="ListNumber"/>
+      </w:pPr>
+      <w:r>
+        <w:t>Open `Users`.</w:t>
+      </w:r>
+    </w:p>
+    <w:p>
+      <w:pPr>
+        <w:pStyle w:val="ListNumber"/>
+      </w:pPr>
+      <w:r>
+        <w:t>Click `Seed sample user`.</w:t>
+      </w:r>
+    </w:p>
+    <w:p>
+      <w:pPr>
+        <w:pStyle w:val="ListNumber"/>
+      </w:pPr>
+      <w:r>
+        <w:t>Wait for the new user card to appear.</w:t>
+      </w:r>
+    </w:p>
+    <w:p>
+      <w:pPr>
+        <w:pStyle w:val="ListNumber"/>
+      </w:pPr>
+      <w:r>
+        <w:t>Open the new user and check the role and permissions.</w:t>
+      </w:r>
+    </w:p>
+    <w:p>
+      <w:pPr>
+        <w:pStyle w:val="Heading3"/>
+      </w:pPr>
+      <w:r>
+        <w:t>Seed a sample device</w:t>
+      </w:r>
+    </w:p>
+    <w:p>
+      <w:pPr/>
+      <w:r>
+        <w:t>Use `Seed sample device` when you want a test device to work with.</w:t>
+      </w:r>
+    </w:p>
+    <w:p>
+      <w:pPr/>
+      <w:r>
         <w:t>What it does:</w:t>
       </w:r>
     </w:p>
@@ -396,7 +508,7 @@
         <w:pStyle w:val="ListBullet"/>
       </w:pPr>
       <w:r>
-        <w:t>adds a sample user record</w:t>
+        <w:t>adds a sample device record</w:t>
       </w:r>
     </w:p>
     <w:p>
@@ -404,7 +516,7 @@
         <w:pStyle w:val="ListBullet"/>
       </w:pPr>
       <w:r>
-        <w:t>gives you a user you can inspect in `Users`</w:t>
+        <w:t>gives you a device you can inspect in `Devices`</w:t>
       </w:r>
     </w:p>
     <w:p>
@@ -412,7 +524,7 @@
         <w:pStyle w:val="ListBullet"/>
       </w:pPr>
       <w:r>
-        <w:t>helps you test the permission side of access</w:t>
+        <w:t>helps you test the trust side of access</w:t>
       </w:r>
     </w:p>
     <w:p>
@@ -426,7 +538,7 @@
         <w:pStyle w:val="ListBullet"/>
       </w:pPr>
       <w:r>
-        <w:t>you want to test a blocked or allowed user path</w:t>
+        <w:t>you want to test a low-trust or trusted device path</w:t>
       </w:r>
     </w:p>
     <w:p>
@@ -434,7 +546,7 @@
         <w:pStyle w:val="ListBullet"/>
       </w:pPr>
       <w:r>
-        <w:t>you want to compare a finance user with a lighter user</w:t>
+        <w:t>you want to compare one device against another</w:t>
       </w:r>
     </w:p>
     <w:p>
@@ -442,7 +554,7 @@
         <w:pStyle w:val="ListBullet"/>
       </w:pPr>
       <w:r>
-        <w:t>you want to reset the flow without creating a custom person first</w:t>
+        <w:t>you want to check how the gate reacts to owner and trust changes</w:t>
       </w:r>
     </w:p>
     <w:p>
@@ -456,15 +568,421 @@
         <w:pStyle w:val="ListNumber"/>
       </w:pPr>
       <w:r>
+        <w:t>Open `Devices`.</w:t>
+      </w:r>
+    </w:p>
+    <w:p>
+      <w:pPr>
+        <w:pStyle w:val="ListNumber"/>
+      </w:pPr>
+      <w:r>
+        <w:t>Click `Seed sample device`.</w:t>
+      </w:r>
+    </w:p>
+    <w:p>
+      <w:pPr>
+        <w:pStyle w:val="ListNumber"/>
+      </w:pPr>
+      <w:r>
+        <w:t>Wait for the new device card to appear.</w:t>
+      </w:r>
+    </w:p>
+    <w:p>
+      <w:pPr>
+        <w:pStyle w:val="ListNumber"/>
+      </w:pPr>
+      <w:r>
+        <w:t>Open the new device and check the trust level and owner.</w:t>
+      </w:r>
+    </w:p>
+    <w:p>
+      <w:pPr>
+        <w:pStyle w:val="Heading3"/>
+      </w:pPr>
+      <w:r>
+        <w:t>Create a sample approval</w:t>
+      </w:r>
+    </w:p>
+    <w:p>
+      <w:pPr/>
+      <w:r>
+        <w:t>Use `Create sample approval` when you want to watch the approval queue fill and clear.</w:t>
+      </w:r>
+    </w:p>
+    <w:p>
+      <w:pPr/>
+      <w:r>
+        <w:t>What it does:</w:t>
+      </w:r>
+    </w:p>
+    <w:p>
+      <w:pPr>
+        <w:pStyle w:val="ListBullet"/>
+      </w:pPr>
+      <w:r>
+        <w:t>adds a local approval request</w:t>
+      </w:r>
+    </w:p>
+    <w:p>
+      <w:pPr>
+        <w:pStyle w:val="ListBullet"/>
+      </w:pPr>
+      <w:r>
+        <w:t>gives you something to review in `Approval Queue`</w:t>
+      </w:r>
+    </w:p>
+    <w:p>
+      <w:pPr>
+        <w:pStyle w:val="ListBullet"/>
+      </w:pPr>
+      <w:r>
+        <w:t>helps you test the approval step without triggering a real risky action first</w:t>
+      </w:r>
+    </w:p>
+    <w:p>
+      <w:pPr/>
+      <w:r>
+        <w:t>When to use it:</w:t>
+      </w:r>
+    </w:p>
+    <w:p>
+      <w:pPr>
+        <w:pStyle w:val="ListBullet"/>
+      </w:pPr>
+      <w:r>
+        <w:t>you want to test the approve and deny buttons</w:t>
+      </w:r>
+    </w:p>
+    <w:p>
+      <w:pPr>
+        <w:pStyle w:val="ListBullet"/>
+      </w:pPr>
+      <w:r>
+        <w:t>you want to see how the audit trail records approval handling</w:t>
+      </w:r>
+    </w:p>
+    <w:p>
+      <w:pPr>
+        <w:pStyle w:val="ListBullet"/>
+      </w:pPr>
+      <w:r>
+        <w:t>you want to confirm the queue is wired correctly</w:t>
+      </w:r>
+    </w:p>
+    <w:p>
+      <w:pPr/>
+      <w:r>
+        <w:t>Click-by-click:</w:t>
+      </w:r>
+    </w:p>
+    <w:p>
+      <w:pPr>
+        <w:pStyle w:val="ListNumber"/>
+      </w:pPr>
+      <w:r>
+        <w:t>Open `Approval Queue`.</w:t>
+      </w:r>
+    </w:p>
+    <w:p>
+      <w:pPr>
+        <w:pStyle w:val="ListNumber"/>
+      </w:pPr>
+      <w:r>
+        <w:t>Click `Create sample approval`.</w:t>
+      </w:r>
+    </w:p>
+    <w:p>
+      <w:pPr>
+        <w:pStyle w:val="ListNumber"/>
+      </w:pPr>
+      <w:r>
+        <w:t>Review the new request.</w:t>
+      </w:r>
+    </w:p>
+    <w:p>
+      <w:pPr>
+        <w:pStyle w:val="ListNumber"/>
+      </w:pPr>
+      <w:r>
+        <w:t>Approve it or deny it.</w:t>
+      </w:r>
+    </w:p>
+    <w:p>
+      <w:pPr>
+        <w:pStyle w:val="ListNumber"/>
+      </w:pPr>
+      <w:r>
+        <w:t>Check `Audit Log` to see the recorded decision.</w:t>
+      </w:r>
+    </w:p>
+    <w:p>
+      <w:pPr>
+        <w:pStyle w:val="Heading3"/>
+      </w:pPr>
+      <w:r>
+        <w:t>Reset demo data</w:t>
+      </w:r>
+    </w:p>
+    <w:p>
+      <w:pPr/>
+      <w:r>
+        <w:t>Use `Reset demo data` when you want to return to the seeded local state.</w:t>
+      </w:r>
+    </w:p>
+    <w:p>
+      <w:pPr/>
+      <w:r>
+        <w:t>What it does:</w:t>
+      </w:r>
+    </w:p>
+    <w:p>
+      <w:pPr>
+        <w:pStyle w:val="ListBullet"/>
+      </w:pPr>
+      <w:r>
+        <w:t>clears the current demo state</w:t>
+      </w:r>
+    </w:p>
+    <w:p>
+      <w:pPr>
+        <w:pStyle w:val="ListBullet"/>
+      </w:pPr>
+      <w:r>
+        <w:t>restores the seeded users, devices, approvals, and audit entries</w:t>
+      </w:r>
+    </w:p>
+    <w:p>
+      <w:pPr>
+        <w:pStyle w:val="ListBullet"/>
+      </w:pPr>
+      <w:r>
+        <w:t>gives you a known starting point for repeat testing</w:t>
+      </w:r>
+    </w:p>
+    <w:p>
+      <w:pPr/>
+      <w:r>
+        <w:t>When to use it:</w:t>
+      </w:r>
+    </w:p>
+    <w:p>
+      <w:pPr>
+        <w:pStyle w:val="ListBullet"/>
+      </w:pPr>
+      <w:r>
+        <w:t>you have changed the seed data and want a fresh start</w:t>
+      </w:r>
+    </w:p>
+    <w:p>
+      <w:pPr>
+        <w:pStyle w:val="ListBullet"/>
+      </w:pPr>
+      <w:r>
+        <w:t>you want to repeat the same test several times</w:t>
+      </w:r>
+    </w:p>
+    <w:p>
+      <w:pPr>
+        <w:pStyle w:val="ListBullet"/>
+      </w:pPr>
+      <w:r>
+        <w:t>you want to compare a clean allow path with a blocked path</w:t>
+      </w:r>
+    </w:p>
+    <w:p>
+      <w:pPr/>
+      <w:r>
+        <w:t>Click-by-click:</w:t>
+      </w:r>
+    </w:p>
+    <w:p>
+      <w:pPr>
+        <w:pStyle w:val="ListNumber"/>
+      </w:pPr>
+      <w:r>
+        <w:t>Open `Users &amp; Devices Control`.</w:t>
+      </w:r>
+    </w:p>
+    <w:p>
+      <w:pPr>
+        <w:pStyle w:val="ListNumber"/>
+      </w:pPr>
+      <w:r>
+        <w:t>Click `Reset demo data`.</w:t>
+      </w:r>
+    </w:p>
+    <w:p>
+      <w:pPr>
+        <w:pStyle w:val="ListNumber"/>
+      </w:pPr>
+      <w:r>
+        <w:t>Wait for the seeded users, devices, approvals, and audit entries to come back.</w:t>
+      </w:r>
+    </w:p>
+    <w:p>
+      <w:pPr>
+        <w:pStyle w:val="ListNumber"/>
+      </w:pPr>
+      <w:r>
+        <w:t>Start the checklist again from the top.</w:t>
+      </w:r>
+    </w:p>
+    <w:p>
+      <w:pPr>
+        <w:pStyle w:val="Heading2"/>
+      </w:pPr>
+      <w:r>
+        <w:t>Quick test checklist</w:t>
+      </w:r>
+    </w:p>
+    <w:p>
+      <w:pPr>
+        <w:pStyle w:val="ListNumber"/>
+      </w:pPr>
+      <w:r>
+        <w:t>Open `Users &amp; Devices Control`.</w:t>
+      </w:r>
+    </w:p>
+    <w:p>
+      <w:pPr>
+        <w:pStyle w:val="ListNumber"/>
+      </w:pPr>
+      <w:r>
+        <w:t>Click `Reset demo data`.</w:t>
+      </w:r>
+    </w:p>
+    <w:p>
+      <w:pPr>
+        <w:pStyle w:val="ListNumber"/>
+      </w:pPr>
+      <w:r>
+        <w:t>Open `Users` and confirm `Hayley Arthur` is active.</w:t>
+      </w:r>
+    </w:p>
+    <w:p>
+      <w:pPr>
+        <w:pStyle w:val="ListNumber"/>
+      </w:pPr>
+      <w:r>
+        <w:t>Open `Devices` and confirm `NEW_EARTH_DEV` is trust level `4`.</w:t>
+      </w:r>
+    </w:p>
+    <w:p>
+      <w:pPr>
+        <w:pStyle w:val="ListNumber"/>
+      </w:pPr>
+      <w:r>
+        <w:t>Open `Access Matrix` and confirm Treasury needs finance permission plus the trust floor.</w:t>
+      </w:r>
+    </w:p>
+    <w:p>
+      <w:pPr>
+        <w:pStyle w:val="ListNumber"/>
+      </w:pPr>
+      <w:r>
+        <w:t>Open the Treasury gate with `Hayley Arthur` and `NEW_EARTH_DEV`.</w:t>
+      </w:r>
+    </w:p>
+    <w:p>
+      <w:pPr>
+        <w:pStyle w:val="ListNumber"/>
+      </w:pPr>
+      <w:r>
+        <w:t>Confirm a normal Treasury open is allowed.</w:t>
+      </w:r>
+    </w:p>
+    <w:p>
+      <w:pPr>
+        <w:pStyle w:val="ListNumber"/>
+      </w:pPr>
+      <w:r>
+        <w:t>Switch to a low-trust device or lighter user and confirm the gate blocks access.</w:t>
+      </w:r>
+    </w:p>
+    <w:p>
+      <w:pPr>
+        <w:pStyle w:val="ListNumber"/>
+      </w:pPr>
+      <w:r>
+        <w:t>Try an approval-required action if the screen offers one.</w:t>
+      </w:r>
+    </w:p>
+    <w:p>
+      <w:pPr>
+        <w:pStyle w:val="ListNumber"/>
+      </w:pPr>
+      <w:r>
+        <w:t>Open `Audit Log` and confirm the allow, deny, or approval event was written.</w:t>
+      </w:r>
+    </w:p>
+    <w:p>
+      <w:pPr>
+        <w:pStyle w:val="Heading2"/>
+      </w:pPr>
+      <w:r>
+        <w:t>Step-by-step Treasury walkthrough</w:t>
+      </w:r>
+    </w:p>
+    <w:p>
+      <w:pPr/>
+      <w:r>
+        <w:t>Use this when you want to test Treasury in order and see each decision point.</w:t>
+      </w:r>
+    </w:p>
+    <w:p>
+      <w:pPr>
+        <w:pStyle w:val="ListNumber"/>
+      </w:pPr>
+      <w:r>
+        <w:t>Open the Dashboard Module Hub.</w:t>
+      </w:r>
+    </w:p>
+    <w:p>
+      <w:pPr/>
+      <w:r>
+        <w:t>Why this matters: this is the entry point that decides whether the security layer is in the path.</w:t>
+      </w:r>
+    </w:p>
+    <w:p>
+      <w:pPr>
+        <w:pStyle w:val="ListNumber"/>
+      </w:pPr>
+      <w:r>
+        <w:t>Select `Users &amp; Devices Control`.</w:t>
+      </w:r>
+    </w:p>
+    <w:p>
+      <w:pPr/>
+      <w:r>
+        <w:t>Why this matters: you want the local registry open before you test any sensitive access.</w:t>
+      </w:r>
+    </w:p>
+    <w:p>
+      <w:pPr>
+        <w:pStyle w:val="ListNumber"/>
+      </w:pPr>
+      <w:r>
         <w:t>Open `Users`.</w:t>
       </w:r>
     </w:p>
     <w:p>
+      <w:pPr/>
+      <w:r>
+        <w:t>Why this matters: the user must exist and be active before Treasury can open.</w:t>
+      </w:r>
+    </w:p>
+    <w:p>
       <w:pPr>
         <w:pStyle w:val="ListNumber"/>
       </w:pPr>
       <w:r>
-        <w:t>Click `Seed sample user`.</w:t>
+        <w:t>Find `Hayley Arthur`.</w:t>
+      </w:r>
+    </w:p>
+    <w:p>
+      <w:pPr/>
+      <w:r>
+        <w:t>Why this matters: she is the seeded finance example for testing the normal path.</w:t>
       </w:r>
     </w:p>
     <w:p>
@@ -472,7 +990,13 @@
         <w:pStyle w:val="ListNumber"/>
       </w:pPr>
       <w:r>
-        <w:t>Wait for the new user card to appear.</w:t>
+        <w:t>Confirm the user is active and has finance access.</w:t>
+      </w:r>
+    </w:p>
+    <w:p>
+      <w:pPr/>
+      <w:r>
+        <w:t>Why this matters: the role and permission must both support finance work.</w:t>
       </w:r>
     </w:p>
     <w:p>
@@ -480,7 +1004,541 @@
         <w:pStyle w:val="ListNumber"/>
       </w:pPr>
       <w:r>
-        <w:t>Open the new user and check the role and permissions.</w:t>
+        <w:t>Open `Devices`.</w:t>
+      </w:r>
+    </w:p>
+    <w:p>
+      <w:pPr/>
+      <w:r>
+        <w:t>Why this matters: device trust is part of the access decision, not just the user.</w:t>
+      </w:r>
+    </w:p>
+    <w:p>
+      <w:pPr>
+        <w:pStyle w:val="ListNumber"/>
+      </w:pPr>
+      <w:r>
+        <w:t>Find `NEW_EARTH_DEV`.</w:t>
+      </w:r>
+    </w:p>
+    <w:p>
+      <w:pPr/>
+      <w:r>
+        <w:t>Why this matters: it is the seeded trusted device for the normal Treasury path.</w:t>
+      </w:r>
+    </w:p>
+    <w:p>
+      <w:pPr>
+        <w:pStyle w:val="ListNumber"/>
+      </w:pPr>
+      <w:r>
+        <w:t>Confirm the device is trusted at level `4`.</w:t>
+      </w:r>
+    </w:p>
+    <w:p>
+      <w:pPr/>
+      <w:r>
+        <w:t>Why this matters: Treasury requires the trust floor to be met.</w:t>
+      </w:r>
+    </w:p>
+    <w:p>
+      <w:pPr>
+        <w:pStyle w:val="ListNumber"/>
+      </w:pPr>
+      <w:r>
+        <w:t>Open `Access Matrix`.</w:t>
+      </w:r>
+    </w:p>
+    <w:p>
+      <w:pPr/>
+      <w:r>
+        <w:t>Why this matters: the rule tells you what Treasury needs before you try the gate.</w:t>
+      </w:r>
+    </w:p>
+    <w:p>
+      <w:pPr>
+        <w:pStyle w:val="ListNumber"/>
+      </w:pPr>
+      <w:r>
+        <w:t>Confirm Treasury needs finance permission and a trust floor of `4`.</w:t>
+      </w:r>
+    </w:p>
+    <w:p>
+      <w:pPr/>
+      <w:r>
+        <w:t>Why this matters: it confirms the system will check both permission and trust.</w:t>
+      </w:r>
+    </w:p>
+    <w:p>
+      <w:pPr>
+        <w:pStyle w:val="ListNumber"/>
+      </w:pPr>
+      <w:r>
+        <w:t>Open the Treasury gate.</w:t>
+      </w:r>
+    </w:p>
+    <w:p>
+      <w:pPr/>
+      <w:r>
+        <w:t>Why this matters: this is the actual check before Treasury opens.</w:t>
+      </w:r>
+    </w:p>
+    <w:p>
+      <w:pPr>
+        <w:pStyle w:val="ListNumber"/>
+      </w:pPr>
+      <w:r>
+        <w:t>Select `Hayley Arthur` and `NEW_EARTH_DEV`.</w:t>
+      </w:r>
+    </w:p>
+    <w:p>
+      <w:pPr/>
+      <w:r>
+        <w:t>Why this matters: the gate needs both the user and device selected at the same time.</w:t>
+      </w:r>
+    </w:p>
+    <w:p>
+      <w:pPr>
+        <w:pStyle w:val="ListNumber"/>
+      </w:pPr>
+      <w:r>
+        <w:t>Click `Open screen`.</w:t>
+      </w:r>
+    </w:p>
+    <w:p>
+      <w:pPr/>
+      <w:r>
+        <w:t>Why this matters: this is the moment the gate either allows or blocks access.</w:t>
+      </w:r>
+    </w:p>
+    <w:p>
+      <w:pPr>
+        <w:pStyle w:val="ListNumber"/>
+      </w:pPr>
+      <w:r>
+        <w:t>If Treasury opens, test a normal view action.</w:t>
+      </w:r>
+    </w:p>
+    <w:p>
+      <w:pPr/>
+      <w:r>
+        <w:t>Why this matters: it proves the normal finance path works after the gate passes.</w:t>
+      </w:r>
+    </w:p>
+    <w:p>
+      <w:pPr>
+        <w:pStyle w:val="ListNumber"/>
+      </w:pPr>
+      <w:r>
+        <w:t>If the gate blocks, read `Why blocked` and fix the missing identity, permission, trust, or approval.</w:t>
+      </w:r>
+    </w:p>
+    <w:p>
+      <w:pPr/>
+      <w:r>
+        <w:t>Why this matters: the block message tells you exactly which part of the rule failed.</w:t>
+      </w:r>
+    </w:p>
+    <w:p>
+      <w:pPr>
+        <w:pStyle w:val="ListNumber"/>
+      </w:pPr>
+      <w:r>
+        <w:t>If the action needs approval, open `Approval Queue`.</w:t>
+      </w:r>
+    </w:p>
+    <w:p>
+      <w:pPr/>
+      <w:r>
+        <w:t>Why this matters: approval-required actions should pause for human review.</w:t>
+      </w:r>
+    </w:p>
+    <w:p>
+      <w:pPr>
+        <w:pStyle w:val="ListNumber"/>
+      </w:pPr>
+      <w:r>
+        <w:t>Review the pending request.</w:t>
+      </w:r>
+    </w:p>
+    <w:p>
+      <w:pPr/>
+      <w:r>
+        <w:t>Why this matters: you need to confirm the request is the one you meant to test.</w:t>
+      </w:r>
+    </w:p>
+    <w:p>
+      <w:pPr>
+        <w:pStyle w:val="ListNumber"/>
+      </w:pPr>
+      <w:r>
+        <w:t>Approve or deny the request.</w:t>
+      </w:r>
+    </w:p>
+    <w:p>
+      <w:pPr/>
+      <w:r>
+        <w:t>Why this matters: this is the human decision point for sensitive actions.</w:t>
+      </w:r>
+    </w:p>
+    <w:p>
+      <w:pPr>
+        <w:pStyle w:val="ListNumber"/>
+      </w:pPr>
+      <w:r>
+        <w:t>Try the action again if approval was granted.</w:t>
+      </w:r>
+    </w:p>
+    <w:p>
+      <w:pPr/>
+      <w:r>
+        <w:t>Why this matters: the action should only continue after approval has been recorded.</w:t>
+      </w:r>
+    </w:p>
+    <w:p>
+      <w:pPr>
+        <w:pStyle w:val="ListNumber"/>
+      </w:pPr>
+      <w:r>
+        <w:t>Open `Audit Log` and confirm the decision was recorded.</w:t>
+      </w:r>
+    </w:p>
+    <w:p>
+      <w:pPr/>
+      <w:r>
+        <w:t>Why this matters: the audit trail proves what happened and why.</w:t>
+      </w:r>
+    </w:p>
+    <w:p>
+      <w:pPr/>
+      <w:r>
+        <w:t>What you should see:</w:t>
+      </w:r>
+    </w:p>
+    <w:p>
+      <w:pPr>
+        <w:pStyle w:val="ListBullet"/>
+      </w:pPr>
+      <w:r>
+        <w:t>The Treasury gate shows the selected user and device.</w:t>
+      </w:r>
+    </w:p>
+    <w:p>
+      <w:pPr>
+        <w:pStyle w:val="ListBullet"/>
+      </w:pPr>
+      <w:r>
+        <w:t>A valid Treasury setup opens the screen.</w:t>
+      </w:r>
+    </w:p>
+    <w:p>
+      <w:pPr>
+        <w:pStyle w:val="ListBullet"/>
+      </w:pPr>
+      <w:r>
+        <w:t>A bad setup shows `Why blocked`.</w:t>
+      </w:r>
+    </w:p>
+    <w:p>
+      <w:pPr>
+        <w:pStyle w:val="ListBullet"/>
+      </w:pPr>
+      <w:r>
+        <w:t>An approval-only action moves into `Approval Queue`.</w:t>
+      </w:r>
+    </w:p>
+    <w:p>
+      <w:pPr>
+        <w:pStyle w:val="ListBullet"/>
+      </w:pPr>
+      <w:r>
+        <w:t>The final decision appears in `Audit Log`.</w:t>
+      </w:r>
+    </w:p>
+    <w:p>
+      <w:pPr>
+        <w:pStyle w:val="Heading2"/>
+      </w:pPr>
+      <w:r>
+        <w:t>Step-by-step access system walkthrough</w:t>
+      </w:r>
+    </w:p>
+    <w:p>
+      <w:pPr/>
+      <w:r>
+        <w:t>Use this when you want to test the whole access system from start to finish.</w:t>
+      </w:r>
+    </w:p>
+    <w:p>
+      <w:pPr>
+        <w:pStyle w:val="ListNumber"/>
+      </w:pPr>
+      <w:r>
+        <w:t>Open `Users &amp; Devices Control`.</w:t>
+      </w:r>
+    </w:p>
+    <w:p>
+      <w:pPr/>
+      <w:r>
+        <w:t>Why this matters: you want the access system reset to a known local state.</w:t>
+      </w:r>
+    </w:p>
+    <w:p>
+      <w:pPr>
+        <w:pStyle w:val="ListNumber"/>
+      </w:pPr>
+      <w:r>
+        <w:t>Click `Reset demo data`.</w:t>
+      </w:r>
+    </w:p>
+    <w:p>
+      <w:pPr/>
+      <w:r>
+        <w:t>Why this matters: a clean seed state makes the later test results easier to trust.</w:t>
+      </w:r>
+    </w:p>
+    <w:p>
+      <w:pPr>
+        <w:pStyle w:val="ListNumber"/>
+      </w:pPr>
+      <w:r>
+        <w:t>Open `Users` and check the sample users.</w:t>
+      </w:r>
+    </w:p>
+    <w:p>
+      <w:pPr/>
+      <w:r>
+        <w:t>Why this matters: you need to know which identities are available for the test.</w:t>
+      </w:r>
+    </w:p>
+    <w:p>
+      <w:pPr>
+        <w:pStyle w:val="ListNumber"/>
+      </w:pPr>
+      <w:r>
+        <w:t>Open `Devices` and compare the trust levels.</w:t>
+      </w:r>
+    </w:p>
+    <w:p>
+      <w:pPr/>
+      <w:r>
+        <w:t>Why this matters: the trust floor only makes sense when you compare devices side by side.</w:t>
+      </w:r>
+    </w:p>
+    <w:p>
+      <w:pPr>
+        <w:pStyle w:val="ListNumber"/>
+      </w:pPr>
+      <w:r>
+        <w:t>Open `Access Matrix` and inspect Treasury rules.</w:t>
+      </w:r>
+    </w:p>
+    <w:p>
+      <w:pPr/>
+      <w:r>
+        <w:t>Why this matters: the rule tells you what the gate will accept or reject.</w:t>
+      </w:r>
+    </w:p>
+    <w:p>
+      <w:pPr>
+        <w:pStyle w:val="ListNumber"/>
+      </w:pPr>
+      <w:r>
+        <w:t>Open the Treasury gate with a trusted user and device.</w:t>
+      </w:r>
+    </w:p>
+    <w:p>
+      <w:pPr/>
+      <w:r>
+        <w:t>Why this matters: this is the main allow path you want to prove works.</w:t>
+      </w:r>
+    </w:p>
+    <w:p>
+      <w:pPr>
+        <w:pStyle w:val="ListNumber"/>
+      </w:pPr>
+      <w:r>
+        <w:t>Confirm the allow path works.</w:t>
+      </w:r>
+    </w:p>
+    <w:p>
+      <w:pPr/>
+      <w:r>
+        <w:t>Why this matters: it shows the basic role, trust, and permission combo is valid.</w:t>
+      </w:r>
+    </w:p>
+    <w:p>
+      <w:pPr>
+        <w:pStyle w:val="ListNumber"/>
+      </w:pPr>
+      <w:r>
+        <w:t>Switch to a lower-trust device and confirm the block path works.</w:t>
+      </w:r>
+    </w:p>
+    <w:p>
+      <w:pPr/>
+      <w:r>
+        <w:t>Why this matters: the system should reject devices that do not meet Treasury's trust floor.</w:t>
+      </w:r>
+    </w:p>
+    <w:p>
+      <w:pPr>
+        <w:pStyle w:val="ListNumber"/>
+      </w:pPr>
+      <w:r>
+        <w:t>Switch to a lighter user and confirm the permission block works.</w:t>
+      </w:r>
+    </w:p>
+    <w:p>
+      <w:pPr/>
+      <w:r>
+        <w:t>Why this matters: the system should reject users who lack the needed finance access.</w:t>
+      </w:r>
+    </w:p>
+    <w:p>
+      <w:pPr>
+        <w:pStyle w:val="ListNumber"/>
+      </w:pPr>
+      <w:r>
+        <w:t>Trigger an approval-required action and confirm it pauses for review.</w:t>
+      </w:r>
+    </w:p>
+    <w:p>
+      <w:pPr/>
+      <w:r>
+        <w:t>Why this matters: sensitive actions should not execute instantly.</w:t>
+      </w:r>
+    </w:p>
+    <w:p>
+      <w:pPr>
+        <w:pStyle w:val="ListNumber"/>
+      </w:pPr>
+      <w:r>
+        <w:t>Open `Approval Queue` and process the request.</w:t>
+      </w:r>
+    </w:p>
+    <w:p>
+      <w:pPr/>
+      <w:r>
+        <w:t>Why this matters: human review is the control point for risky actions.</w:t>
+      </w:r>
+    </w:p>
+    <w:p>
+      <w:pPr>
+        <w:pStyle w:val="ListNumber"/>
+      </w:pPr>
+      <w:r>
+        <w:t>Review the result in `Audit Log`.</w:t>
+      </w:r>
+    </w:p>
+    <w:p>
+      <w:pPr/>
+      <w:r>
+        <w:t>Why this matters: every allow, deny, or approval should leave a trace.</w:t>
+      </w:r>
+    </w:p>
+    <w:p>
+      <w:pPr>
+        <w:pStyle w:val="ListNumber"/>
+      </w:pPr>
+      <w:r>
+        <w:t>Open `Device Onboarding` and register a sample device if you want to test trust setup.</w:t>
+      </w:r>
+    </w:p>
+    <w:p>
+      <w:pPr/>
+      <w:r>
+        <w:t>Why this matters: onboarding is how a device becomes trusted enough for later access.</w:t>
+      </w:r>
+    </w:p>
+    <w:p>
+      <w:pPr>
+        <w:pStyle w:val="ListNumber"/>
+      </w:pPr>
+      <w:r>
+        <w:t>Open `Security Lock` and confirm the selected context matches what you expect.</w:t>
+      </w:r>
+    </w:p>
+    <w:p>
+      <w:pPr/>
+      <w:r>
+        <w:t>Why this matters: the lock view is a quick sanity check for the current local context.</w:t>
+      </w:r>
+    </w:p>
+    <w:p>
+      <w:pPr>
+        <w:pStyle w:val="ListNumber"/>
+      </w:pPr>
+      <w:r>
+        <w:t>Watch the top-left session box count down while the session stays active, and confirm the active user label and online status match what you expect.</w:t>
+      </w:r>
+    </w:p>
+    <w:p>
+      <w:pPr/>
+      <w:r>
+        <w:t>Why this matters: you can see the live timeout instead of guessing.</w:t>
+      </w:r>
+    </w:p>
+    <w:p>
+      <w:pPr/>
+      <w:r>
+        <w:t>What you should see:</w:t>
+      </w:r>
+    </w:p>
+    <w:p>
+      <w:pPr>
+        <w:pStyle w:val="ListBullet"/>
+      </w:pPr>
+      <w:r>
+        <w:t>The trusted user and device path is allowed.</w:t>
+      </w:r>
+    </w:p>
+    <w:p>
+      <w:pPr>
+        <w:pStyle w:val="ListBullet"/>
+      </w:pPr>
+      <w:r>
+        <w:t>The low-trust device path is blocked.</w:t>
+      </w:r>
+    </w:p>
+    <w:p>
+      <w:pPr>
+        <w:pStyle w:val="ListBullet"/>
+      </w:pPr>
+      <w:r>
+        <w:t>The lighter user path is blocked for permission reasons.</w:t>
+      </w:r>
+    </w:p>
+    <w:p>
+      <w:pPr>
+        <w:pStyle w:val="ListBullet"/>
+      </w:pPr>
+      <w:r>
+        <w:t>The approval path pauses until review happens.</w:t>
+      </w:r>
+    </w:p>
+    <w:p>
+      <w:pPr>
+        <w:pStyle w:val="ListBullet"/>
+      </w:pPr>
+      <w:r>
+        <w:t>Device onboarding writes a new trusted record.</w:t>
+      </w:r>
+    </w:p>
+    <w:p>
+      <w:pPr>
+        <w:pStyle w:val="ListBullet"/>
+      </w:pPr>
+      <w:r>
+        <w:t>Security Lock matches the current local context.</w:t>
+      </w:r>
+    </w:p>
+    <w:p>
+      <w:pPr>
+        <w:pStyle w:val="Heading2"/>
+      </w:pPr>
+      <w:r>
+        <w:t>What each screen is for</w:t>
       </w:r>
     </w:p>
     <w:p>
@@ -488,19 +1546,265 @@
         <w:pStyle w:val="Heading3"/>
       </w:pPr>
       <w:r>
-        <w:t>Seed a sample device</w:t>
+        <w:t>Users</w:t>
       </w:r>
     </w:p>
     <w:p>
       <w:pPr/>
       <w:r>
-        <w:t>Use `Seed sample device` when you want a test device to work with.</w:t>
+        <w:t>Check the person. Confirm the role, permissions, and linked devices.</w:t>
+      </w:r>
+    </w:p>
+    <w:p>
+      <w:pPr>
+        <w:pStyle w:val="Heading3"/>
+      </w:pPr>
+      <w:r>
+        <w:t>Devices</w:t>
       </w:r>
     </w:p>
     <w:p>
       <w:pPr/>
       <w:r>
-        <w:t>What it does:</w:t>
+        <w:t>Check the device. Confirm the trust level, owner, and allowed actions.</w:t>
+      </w:r>
+    </w:p>
+    <w:p>
+      <w:pPr>
+        <w:pStyle w:val="Heading3"/>
+      </w:pPr>
+      <w:r>
+        <w:t>Access Matrix</w:t>
+      </w:r>
+    </w:p>
+    <w:p>
+      <w:pPr/>
+      <w:r>
+        <w:t>Check the rule. Confirm the required permission, trust floor, and approval rules.</w:t>
+      </w:r>
+    </w:p>
+    <w:p>
+      <w:pPr>
+        <w:pStyle w:val="Heading3"/>
+      </w:pPr>
+      <w:r>
+        <w:t>Device Onboarding</w:t>
+      </w:r>
+    </w:p>
+    <w:p>
+      <w:pPr/>
+      <w:r>
+        <w:t>Use this when a new device needs to become trusted.</w:t>
+      </w:r>
+    </w:p>
+    <w:p>
+      <w:pPr>
+        <w:pStyle w:val="Heading3"/>
+      </w:pPr>
+      <w:r>
+        <w:t>Approval Queue</w:t>
+      </w:r>
+    </w:p>
+    <w:p>
+      <w:pPr/>
+      <w:r>
+        <w:t>Use this when a valid action needs human review before it can continue.</w:t>
+      </w:r>
+    </w:p>
+    <w:p>
+      <w:pPr>
+        <w:pStyle w:val="Heading3"/>
+      </w:pPr>
+      <w:r>
+        <w:t>Audit Log</w:t>
+      </w:r>
+    </w:p>
+    <w:p>
+      <w:pPr/>
+      <w:r>
+        <w:t>Use this to verify what happened and why the system allowed, denied, or paused access.</w:t>
+      </w:r>
+    </w:p>
+    <w:p>
+      <w:pPr>
+        <w:pStyle w:val="Heading2"/>
+      </w:pPr>
+      <w:r>
+        <w:t>Full Treasury walkthrough</w:t>
+      </w:r>
+    </w:p>
+    <w:p>
+      <w:pPr/>
+      <w:r>
+        <w:t>Use this if you want the Treasury-only version with a tighter path.</w:t>
+      </w:r>
+    </w:p>
+    <w:p>
+      <w:pPr>
+        <w:pStyle w:val="ListNumber"/>
+      </w:pPr>
+      <w:r>
+        <w:t>Open the Dashboard Module Hub.</w:t>
+      </w:r>
+    </w:p>
+    <w:p>
+      <w:pPr/>
+      <w:r>
+        <w:t>Why this matters: this is the entry point where you first reach the control layer.</w:t>
+      </w:r>
+    </w:p>
+    <w:p>
+      <w:pPr>
+        <w:pStyle w:val="ListNumber"/>
+      </w:pPr>
+      <w:r>
+        <w:t>Select `Users &amp; Devices Control`.</w:t>
+      </w:r>
+    </w:p>
+    <w:p>
+      <w:pPr/>
+      <w:r>
+        <w:t>Why this matters: Treasury cannot be checked until the local registry is open.</w:t>
+      </w:r>
+    </w:p>
+    <w:p>
+      <w:pPr>
+        <w:pStyle w:val="ListNumber"/>
+      </w:pPr>
+      <w:r>
+        <w:t>Open `Users` and confirm the finance user is active.</w:t>
+      </w:r>
+    </w:p>
+    <w:p>
+      <w:pPr/>
+      <w:r>
+        <w:t>Why this matters: the person has to exist and be active before finance access can work.</w:t>
+      </w:r>
+    </w:p>
+    <w:p>
+      <w:pPr>
+        <w:pStyle w:val="ListNumber"/>
+      </w:pPr>
+      <w:r>
+        <w:t>Open `Devices` and confirm the device is trusted enough.</w:t>
+      </w:r>
+    </w:p>
+    <w:p>
+      <w:pPr/>
+      <w:r>
+        <w:t>Why this matters: Treasury depends on device trust as well as user identity.</w:t>
+      </w:r>
+    </w:p>
+    <w:p>
+      <w:pPr>
+        <w:pStyle w:val="ListNumber"/>
+      </w:pPr>
+      <w:r>
+        <w:t>Open `Access Matrix` and confirm Treasury needs the right permission and trust floor.</w:t>
+      </w:r>
+    </w:p>
+    <w:p>
+      <w:pPr/>
+      <w:r>
+        <w:t>Why this matters: this tells you exactly what the gate will require.</w:t>
+      </w:r>
+    </w:p>
+    <w:p>
+      <w:pPr>
+        <w:pStyle w:val="ListNumber"/>
+      </w:pPr>
+      <w:r>
+        <w:t>Open the Treasury gate.</w:t>
+      </w:r>
+    </w:p>
+    <w:p>
+      <w:pPr/>
+      <w:r>
+        <w:t>Why this matters: this is the actual allow/deny checkpoint.</w:t>
+      </w:r>
+    </w:p>
+    <w:p>
+      <w:pPr>
+        <w:pStyle w:val="ListNumber"/>
+      </w:pPr>
+      <w:r>
+        <w:t>Select the user and device.</w:t>
+      </w:r>
+    </w:p>
+    <w:p>
+      <w:pPr/>
+      <w:r>
+        <w:t>Why this matters: the gate uses both selections together.</w:t>
+      </w:r>
+    </w:p>
+    <w:p>
+      <w:pPr>
+        <w:pStyle w:val="ListNumber"/>
+      </w:pPr>
+      <w:r>
+        <w:t>Click `Open screen`.</w:t>
+      </w:r>
+    </w:p>
+    <w:p>
+      <w:pPr/>
+      <w:r>
+        <w:t>Why this matters: this is the moment the gate decides whether to let Treasury open.</w:t>
+      </w:r>
+    </w:p>
+    <w:p>
+      <w:pPr>
+        <w:pStyle w:val="ListNumber"/>
+      </w:pPr>
+      <w:r>
+        <w:t>If blocked, read `Why blocked` and fix the missing identity, permission, trust, or approval.</w:t>
+      </w:r>
+    </w:p>
+    <w:p>
+      <w:pPr/>
+      <w:r>
+        <w:t>Why this matters: the block message points to the exact missing piece.</w:t>
+      </w:r>
+    </w:p>
+    <w:p>
+      <w:pPr>
+        <w:pStyle w:val="ListNumber"/>
+      </w:pPr>
+      <w:r>
+        <w:t>If approval is needed, review `Approval Queue`, approve or deny it, then try again.</w:t>
+      </w:r>
+    </w:p>
+    <w:p>
+      <w:pPr/>
+      <w:r>
+        <w:t>Why this matters: sensitive actions should pause for a human decision.</w:t>
+      </w:r>
+    </w:p>
+    <w:p>
+      <w:pPr>
+        <w:pStyle w:val="ListNumber"/>
+      </w:pPr>
+      <w:r>
+        <w:t>Open `Audit Log` and confirm the decision was recorded.</w:t>
+      </w:r>
+    </w:p>
+    <w:p>
+      <w:pPr/>
+      <w:r>
+        <w:t>Why this matters: the audit trail proves what happened and why.</w:t>
+      </w:r>
+    </w:p>
+    <w:p>
+      <w:pPr>
+        <w:pStyle w:val="Heading2"/>
+      </w:pPr>
+      <w:r>
+        <w:t>If something looks wrong</w:t>
+      </w:r>
+    </w:p>
+    <w:p>
+      <w:pPr/>
+      <w:r>
+        <w:t>Check these first:</w:t>
       </w:r>
     </w:p>
     <w:p>
@@ -508,7 +1812,7 @@
         <w:pStyle w:val="ListBullet"/>
       </w:pPr>
       <w:r>
-        <w:t>adds a sample device record</w:t>
+        <w:t>Is the selected user archived?</w:t>
       </w:r>
     </w:p>
     <w:p>
@@ -516,7 +1820,7 @@
         <w:pStyle w:val="ListBullet"/>
       </w:pPr>
       <w:r>
-        <w:t>gives you a device you can inspect in `Devices`</w:t>
+        <w:t>Is the selected device blocked or low trust?</w:t>
       </w:r>
     </w:p>
     <w:p>
@@ -524,13 +1828,37 @@
         <w:pStyle w:val="ListBullet"/>
       </w:pPr>
       <w:r>
-        <w:t>helps you test the trust side of access</w:t>
+        <w:t>Does the role have the right permission?</w:t>
+      </w:r>
+    </w:p>
+    <w:p>
+      <w:pPr>
+        <w:pStyle w:val="ListBullet"/>
+      </w:pPr>
+      <w:r>
+        <w:t>Is the action waiting for approval?</w:t>
+      </w:r>
+    </w:p>
+    <w:p>
+      <w:pPr>
+        <w:pStyle w:val="ListBullet"/>
+      </w:pPr>
+      <w:r>
+        <w:t>Did the gate write an audit event?</w:t>
+      </w:r>
+    </w:p>
+    <w:p>
+      <w:pPr>
+        <w:pStyle w:val="Heading2"/>
+      </w:pPr>
+      <w:r>
+        <w:t>Common mistakes</w:t>
       </w:r>
     </w:p>
     <w:p>
       <w:pPr/>
       <w:r>
-        <w:t>When to use it:</w:t>
+        <w:t>These are the most common reasons a test does not behave as expected.</w:t>
       </w:r>
     </w:p>
     <w:p>
@@ -538,7 +1866,7 @@
         <w:pStyle w:val="ListBullet"/>
       </w:pPr>
       <w:r>
-        <w:t>you want to test a low-trust or trusted device path</w:t>
+        <w:t>You clicked `Open screen` before selecting both the user and the device.</w:t>
       </w:r>
     </w:p>
     <w:p>
@@ -546,7 +1874,7 @@
         <w:pStyle w:val="ListBullet"/>
       </w:pPr>
       <w:r>
-        <w:t>you want to compare one device against another</w:t>
+        <w:t>You used a low-trust device for the Treasury path.</w:t>
       </w:r>
     </w:p>
     <w:p>
@@ -554,13 +1882,53 @@
         <w:pStyle w:val="ListBullet"/>
       </w:pPr>
       <w:r>
-        <w:t>you want to check how the gate reacts to owner and trust changes</w:t>
+        <w:t>You tested a user that does not have finance permissions.</w:t>
+      </w:r>
+    </w:p>
+    <w:p>
+      <w:pPr>
+        <w:pStyle w:val="ListBullet"/>
+      </w:pPr>
+      <w:r>
+        <w:t>You forgot to reset the demo data after changing the seed state.</w:t>
+      </w:r>
+    </w:p>
+    <w:p>
+      <w:pPr>
+        <w:pStyle w:val="ListBullet"/>
+      </w:pPr>
+      <w:r>
+        <w:t>You looked for the approval result before processing the request in `Approval Queue`.</w:t>
+      </w:r>
+    </w:p>
+    <w:p>
+      <w:pPr>
+        <w:pStyle w:val="ListBullet"/>
+      </w:pPr>
+      <w:r>
+        <w:t>You expected the audit log to change before the action was actually allowed or denied.</w:t>
+      </w:r>
+    </w:p>
+    <w:p>
+      <w:pPr>
+        <w:pStyle w:val="ListBullet"/>
+      </w:pPr>
+      <w:r>
+        <w:t>You seeded a new item but did not refresh or re-open the relevant screen.</w:t>
+      </w:r>
+    </w:p>
+    <w:p>
+      <w:pPr>
+        <w:pStyle w:val="Heading2"/>
+      </w:pPr>
+      <w:r>
+        <w:t>Safe habit</w:t>
       </w:r>
     </w:p>
     <w:p>
       <w:pPr/>
       <w:r>
-        <w:t>Click-by-click:</w:t>
+        <w:t>For Treasury, always check:</w:t>
       </w:r>
     </w:p>
     <w:p>
@@ -568,7 +1936,7 @@
         <w:pStyle w:val="ListNumber"/>
       </w:pPr>
       <w:r>
-        <w:t>Open `Devices`.</w:t>
+        <w:t>the person</w:t>
       </w:r>
     </w:p>
     <w:p>
@@ -576,7 +1944,7 @@
         <w:pStyle w:val="ListNumber"/>
       </w:pPr>
       <w:r>
-        <w:t>Click `Seed sample device`.</w:t>
+        <w:t>the device</w:t>
       </w:r>
     </w:p>
     <w:p>
@@ -584,7 +1952,7 @@
         <w:pStyle w:val="ListNumber"/>
       </w:pPr>
       <w:r>
-        <w:t>Wait for the new device card to appear.</w:t>
+        <w:t>the permission</w:t>
       </w:r>
     </w:p>
     <w:p>
@@ -592,87 +1960,7 @@
         <w:pStyle w:val="ListNumber"/>
       </w:pPr>
       <w:r>
-        <w:t>Open the new device and check the trust level and owner.</w:t>
-      </w:r>
-    </w:p>
-    <w:p>
-      <w:pPr>
-        <w:pStyle w:val="Heading3"/>
-      </w:pPr>
-      <w:r>
-        <w:t>Create a sample approval</w:t>
-      </w:r>
-    </w:p>
-    <w:p>
-      <w:pPr/>
-      <w:r>
-        <w:t>Use `Create sample approval` when you want to watch the approval queue fill and clear.</w:t>
-      </w:r>
-    </w:p>
-    <w:p>
-      <w:pPr/>
-      <w:r>
-        <w:t>What it does:</w:t>
-      </w:r>
-    </w:p>
-    <w:p>
-      <w:pPr>
-        <w:pStyle w:val="ListBullet"/>
-      </w:pPr>
-      <w:r>
-        <w:t>adds a local approval request</w:t>
-      </w:r>
-    </w:p>
-    <w:p>
-      <w:pPr>
-        <w:pStyle w:val="ListBullet"/>
-      </w:pPr>
-      <w:r>
-        <w:t>gives you something to review in `Approval Queue`</w:t>
-      </w:r>
-    </w:p>
-    <w:p>
-      <w:pPr>
-        <w:pStyle w:val="ListBullet"/>
-      </w:pPr>
-      <w:r>
-        <w:t>helps you test the approval step without triggering a real risky action first</w:t>
-      </w:r>
-    </w:p>
-    <w:p>
-      <w:pPr/>
-      <w:r>
-        <w:t>When to use it:</w:t>
-      </w:r>
-    </w:p>
-    <w:p>
-      <w:pPr>
-        <w:pStyle w:val="ListBullet"/>
-      </w:pPr>
-      <w:r>
-        <w:t>you want to test the approve and deny buttons</w:t>
-      </w:r>
-    </w:p>
-    <w:p>
-      <w:pPr>
-        <w:pStyle w:val="ListBullet"/>
-      </w:pPr>
-      <w:r>
-        <w:t>you want to see how the audit trail records approval handling</w:t>
-      </w:r>
-    </w:p>
-    <w:p>
-      <w:pPr>
-        <w:pStyle w:val="ListBullet"/>
-      </w:pPr>
-      <w:r>
-        <w:t>you want to confirm the queue is wired correctly</w:t>
-      </w:r>
-    </w:p>
-    <w:p>
-      <w:pPr/>
-      <w:r>
-        <w:t>Click-by-click:</w:t>
+        <w:t>the trust floor</w:t>
       </w:r>
     </w:p>
     <w:p>
@@ -680,7 +1968,7 @@
         <w:pStyle w:val="ListNumber"/>
       </w:pPr>
       <w:r>
-        <w:t>Open `Approval Queue`.</w:t>
+        <w:t>whether the action needs approval</w:t>
       </w:r>
     </w:p>
     <w:p>
@@ -688,7 +1976,20 @@
         <w:pStyle w:val="ListNumber"/>
       </w:pPr>
       <w:r>
-        <w:t>Click `Create sample approval`.</w:t>
+        <w:t>the audit trail</w:t>
+      </w:r>
+    </w:p>
+    <w:p>
+      <w:pPr>
+        <w:pStyle w:val="Heading2"/>
+      </w:pPr>
+      <w:r>
+        <w:t>Startup flow</w:t>
+      </w:r>
+    </w:p>
+    <w:p>
+      <w:r>
+        <w:t>Use this flow when you want to understand how the app opens now.</w:t>
       </w:r>
     </w:p>
     <w:p>
@@ -696,7 +1997,7 @@
         <w:pStyle w:val="ListNumber"/>
       </w:pPr>
       <w:r>
-        <w:t>Review the new request.</w:t>
+        <w:t>Launch the app.</w:t>
       </w:r>
     </w:p>
     <w:p>
@@ -704,7 +2005,7 @@
         <w:pStyle w:val="ListNumber"/>
       </w:pPr>
       <w:r>
-        <w:t>Approve it or deny it.</w:t>
+        <w:t>Review Security Lock.</w:t>
       </w:r>
     </w:p>
     <w:p>
@@ -712,87 +2013,7 @@
         <w:pStyle w:val="ListNumber"/>
       </w:pPr>
       <w:r>
-        <w:t>Check `Audit Log` to see the recorded decision.</w:t>
-      </w:r>
-    </w:p>
-    <w:p>
-      <w:pPr>
-        <w:pStyle w:val="Heading3"/>
-      </w:pPr>
-      <w:r>
-        <w:t>Reset demo data</w:t>
-      </w:r>
-    </w:p>
-    <w:p>
-      <w:pPr/>
-      <w:r>
-        <w:t>Use `Reset demo data` when you want to return to the seeded local state.</w:t>
-      </w:r>
-    </w:p>
-    <w:p>
-      <w:pPr/>
-      <w:r>
-        <w:t>What it does:</w:t>
-      </w:r>
-    </w:p>
-    <w:p>
-      <w:pPr>
-        <w:pStyle w:val="ListBullet"/>
-      </w:pPr>
-      <w:r>
-        <w:t>clears the current demo state</w:t>
-      </w:r>
-    </w:p>
-    <w:p>
-      <w:pPr>
-        <w:pStyle w:val="ListBullet"/>
-      </w:pPr>
-      <w:r>
-        <w:t>restores the seeded users, devices, approvals, and audit entries</w:t>
-      </w:r>
-    </w:p>
-    <w:p>
-      <w:pPr>
-        <w:pStyle w:val="ListBullet"/>
-      </w:pPr>
-      <w:r>
-        <w:t>gives you a known starting point for repeat testing</w:t>
-      </w:r>
-    </w:p>
-    <w:p>
-      <w:pPr/>
-      <w:r>
-        <w:t>When to use it:</w:t>
-      </w:r>
-    </w:p>
-    <w:p>
-      <w:pPr>
-        <w:pStyle w:val="ListBullet"/>
-      </w:pPr>
-      <w:r>
-        <w:t>you have changed the seed data and want a fresh start</w:t>
-      </w:r>
-    </w:p>
-    <w:p>
-      <w:pPr>
-        <w:pStyle w:val="ListBullet"/>
-      </w:pPr>
-      <w:r>
-        <w:t>you want to repeat the same test several times</w:t>
-      </w:r>
-    </w:p>
-    <w:p>
-      <w:pPr>
-        <w:pStyle w:val="ListBullet"/>
-      </w:pPr>
-      <w:r>
-        <w:t>you want to compare a clean allow path with a blocked path</w:t>
-      </w:r>
-    </w:p>
-    <w:p>
-      <w:pPr/>
-      <w:r>
-        <w:t>Click-by-click:</w:t>
+        <w:t>Pick the local user and device.</w:t>
       </w:r>
     </w:p>
     <w:p>
@@ -800,7 +2021,7 @@
         <w:pStyle w:val="ListNumber"/>
       </w:pPr>
       <w:r>
-        <w:t>Open `Users &amp; Devices Control`.</w:t>
+        <w:t>Unlock into the dashboard, or into the voice gate if that option is turned on.</w:t>
       </w:r>
     </w:p>
     <w:p>
@@ -808,7 +2029,15 @@
         <w:pStyle w:val="ListNumber"/>
       </w:pPr>
       <w:r>
-        <w:t>Click `Reset demo data`.</w:t>
+        <w:t>Open Settings if you want to show or hide the voice startup gate.</w:t>
+      </w:r>
+    </w:p>
+    <w:p>
+      <w:pPr>
+        <w:pStyle w:val="Heading2"/>
+      </w:pPr>
+      <w:r>
+        <w:t>Quick startup check</w:t>
       </w:r>
     </w:p>
     <w:p>
@@ -816,7 +2045,7 @@
         <w:pStyle w:val="ListNumber"/>
       </w:pPr>
       <w:r>
-        <w:t>Wait for the seeded users, devices, approvals, and audit entries to come back.</w:t>
+        <w:t>Open Security Lock from app start and confirm the New Earth desktop image appears behind the gate.</w:t>
       </w:r>
     </w:p>
     <w:p>
@@ -824,15 +2053,7 @@
         <w:pStyle w:val="ListNumber"/>
       </w:pPr>
       <w:r>
-        <w:t>Start the checklist again from the top.</w:t>
-      </w:r>
-    </w:p>
-    <w:p>
-      <w:pPr>
-        <w:pStyle w:val="Heading2"/>
-      </w:pPr>
-      <w:r>
-        <w:t>Quick test checklist</w:t>
+        <w:t>Turn the voice startup gate on in Settings if you want the headset check after unlock.</w:t>
       </w:r>
     </w:p>
     <w:p>
@@ -840,1143 +2061,47 @@
         <w:pStyle w:val="ListNumber"/>
       </w:pPr>
       <w:r>
-        <w:t>Open `Users &amp; Devices Control`.</w:t>
-      </w:r>
-    </w:p>
-    <w:p>
-      <w:pPr>
-        <w:pStyle w:val="ListNumber"/>
-      </w:pPr>
-      <w:r>
-        <w:t>Click `Reset demo data`.</w:t>
-      </w:r>
-    </w:p>
-    <w:p>
-      <w:pPr>
-        <w:pStyle w:val="ListNumber"/>
-      </w:pPr>
-      <w:r>
-        <w:t>Open `Users` and confirm `Hayley Arthur` is active.</w:t>
-      </w:r>
-    </w:p>
-    <w:p>
-      <w:pPr>
-        <w:pStyle w:val="ListNumber"/>
-      </w:pPr>
-      <w:r>
-        <w:t>Open `Devices` and confirm `NEW_EARTH_DEV` is trust level `4`.</w:t>
-      </w:r>
-    </w:p>
-    <w:p>
-      <w:pPr>
-        <w:pStyle w:val="ListNumber"/>
-      </w:pPr>
-      <w:r>
-        <w:t>Open `Access Matrix` and confirm Treasury needs finance permission plus the trust floor.</w:t>
-      </w:r>
-    </w:p>
-    <w:p>
-      <w:pPr>
-        <w:pStyle w:val="ListNumber"/>
-      </w:pPr>
-      <w:r>
-        <w:t>Open the Treasury gate with `Hayley Arthur` and `NEW_EARTH_DEV`.</w:t>
-      </w:r>
-    </w:p>
-    <w:p>
-      <w:pPr>
-        <w:pStyle w:val="ListNumber"/>
-      </w:pPr>
-      <w:r>
-        <w:t>Confirm a normal Treasury open is allowed.</w:t>
-      </w:r>
-    </w:p>
-    <w:p>
-      <w:pPr>
-        <w:pStyle w:val="ListNumber"/>
-      </w:pPr>
-      <w:r>
-        <w:t>Switch to a low-trust device or lighter user and confirm the gate blocks access.</w:t>
-      </w:r>
-    </w:p>
-    <w:p>
-      <w:pPr>
-        <w:pStyle w:val="ListNumber"/>
-      </w:pPr>
-      <w:r>
-        <w:t>Try an approval-required action if the screen offers one.</w:t>
-      </w:r>
-    </w:p>
-    <w:p>
-      <w:pPr>
-        <w:pStyle w:val="ListNumber"/>
-      </w:pPr>
-      <w:r>
-        <w:t>Open `Audit Log` and confirm the allow, deny, or approval event was written.</w:t>
-      </w:r>
-    </w:p>
-    <w:p>
-      <w:pPr>
-        <w:pStyle w:val="Heading2"/>
-      </w:pPr>
-      <w:r>
-        <w:t>Step-by-step Treasury walkthrough</w:t>
-      </w:r>
-    </w:p>
-    <w:p>
-      <w:pPr/>
-      <w:r>
-        <w:t>Use this when you want to test Treasury in order and see each decision point.</w:t>
-      </w:r>
-    </w:p>
-    <w:p>
-      <w:pPr>
-        <w:pStyle w:val="ListNumber"/>
-      </w:pPr>
-      <w:r>
-        <w:t>Open the Dashboard Module Hub.</w:t>
-      </w:r>
-    </w:p>
-    <w:p>
-      <w:pPr/>
-      <w:r>
-        <w:t>Why this matters: this is the entry point that decides whether the security layer is in the path.</w:t>
-      </w:r>
-    </w:p>
-    <w:p>
-      <w:pPr>
-        <w:pStyle w:val="ListNumber"/>
-      </w:pPr>
-      <w:r>
-        <w:t>Select `Users &amp; Devices Control`.</w:t>
-      </w:r>
-    </w:p>
-    <w:p>
-      <w:pPr/>
-      <w:r>
-        <w:t>Why this matters: you want the local registry open before you test any sensitive access.</w:t>
-      </w:r>
-    </w:p>
-    <w:p>
-      <w:pPr>
-        <w:pStyle w:val="ListNumber"/>
-      </w:pPr>
-      <w:r>
-        <w:t>Open `Users`.</w:t>
-      </w:r>
-    </w:p>
-    <w:p>
-      <w:pPr/>
-      <w:r>
-        <w:t>Why this matters: the user must exist and be active before Treasury can open.</w:t>
-      </w:r>
-    </w:p>
-    <w:p>
-      <w:pPr>
-        <w:pStyle w:val="ListNumber"/>
-      </w:pPr>
-      <w:r>
-        <w:t>Find `Hayley Arthur`.</w:t>
-      </w:r>
-    </w:p>
-    <w:p>
-      <w:pPr/>
-      <w:r>
-        <w:t>Why this matters: she is the seeded finance example for testing the normal path.</w:t>
-      </w:r>
-    </w:p>
-    <w:p>
-      <w:pPr>
-        <w:pStyle w:val="ListNumber"/>
-      </w:pPr>
-      <w:r>
-        <w:t>Confirm the user is active and has finance access.</w:t>
-      </w:r>
-    </w:p>
-    <w:p>
-      <w:pPr/>
-      <w:r>
-        <w:t>Why this matters: the role and permission must both support finance work.</w:t>
-      </w:r>
-    </w:p>
-    <w:p>
-      <w:pPr>
-        <w:pStyle w:val="ListNumber"/>
-      </w:pPr>
-      <w:r>
-        <w:t>Open `Devices`.</w:t>
-      </w:r>
-    </w:p>
-    <w:p>
-      <w:pPr/>
-      <w:r>
-        <w:t>Why this matters: device trust is part of the access decision, not just the user.</w:t>
-      </w:r>
-    </w:p>
-    <w:p>
-      <w:pPr>
-        <w:pStyle w:val="ListNumber"/>
-      </w:pPr>
-      <w:r>
-        <w:t>Find `NEW_EARTH_DEV`.</w:t>
-      </w:r>
-    </w:p>
-    <w:p>
-      <w:pPr/>
-      <w:r>
-        <w:t>Why this matters: it is the seeded trusted device for the normal Treasury path.</w:t>
-      </w:r>
-    </w:p>
-    <w:p>
-      <w:pPr>
-        <w:pStyle w:val="ListNumber"/>
-      </w:pPr>
-      <w:r>
-        <w:t>Confirm the device is trusted at level `4`.</w:t>
-      </w:r>
-    </w:p>
-    <w:p>
-      <w:pPr/>
-      <w:r>
-        <w:t>Why this matters: Treasury requires the trust floor to be met.</w:t>
-      </w:r>
-    </w:p>
-    <w:p>
-      <w:pPr>
-        <w:pStyle w:val="ListNumber"/>
-      </w:pPr>
-      <w:r>
-        <w:t>Open `Access Matrix`.</w:t>
-      </w:r>
-    </w:p>
-    <w:p>
-      <w:pPr/>
-      <w:r>
-        <w:t>Why this matters: the rule tells you what Treasury needs before you try the gate.</w:t>
-      </w:r>
-    </w:p>
-    <w:p>
-      <w:pPr>
-        <w:pStyle w:val="ListNumber"/>
-      </w:pPr>
-      <w:r>
-        <w:t>Confirm Treasury needs finance permission and a trust floor of `4`.</w:t>
-      </w:r>
-    </w:p>
-    <w:p>
-      <w:pPr/>
-      <w:r>
-        <w:t>Why this matters: it confirms the system will check both permission and trust.</w:t>
-      </w:r>
-    </w:p>
-    <w:p>
-      <w:pPr>
-        <w:pStyle w:val="ListNumber"/>
-      </w:pPr>
-      <w:r>
-        <w:t>Open the Treasury gate.</w:t>
-      </w:r>
-    </w:p>
-    <w:p>
-      <w:pPr/>
-      <w:r>
-        <w:t>Why this matters: this is the actual check before Treasury opens.</w:t>
-      </w:r>
-    </w:p>
-    <w:p>
-      <w:pPr>
-        <w:pStyle w:val="ListNumber"/>
-      </w:pPr>
-      <w:r>
-        <w:t>Select `Hayley Arthur` and `NEW_EARTH_DEV`.</w:t>
-      </w:r>
-    </w:p>
-    <w:p>
-      <w:pPr/>
-      <w:r>
-        <w:t>Why this matters: the gate needs both the user and device selected at the same time.</w:t>
-      </w:r>
-    </w:p>
-    <w:p>
-      <w:pPr>
-        <w:pStyle w:val="ListNumber"/>
-      </w:pPr>
-      <w:r>
-        <w:t>Click `Open screen`.</w:t>
-      </w:r>
-    </w:p>
-    <w:p>
-      <w:pPr/>
-      <w:r>
-        <w:t>Why this matters: this is the moment the gate either allows or blocks access.</w:t>
-      </w:r>
-    </w:p>
-    <w:p>
-      <w:pPr>
-        <w:pStyle w:val="ListNumber"/>
-      </w:pPr>
-      <w:r>
-        <w:t>If Treasury opens, test a normal view action.</w:t>
-      </w:r>
-    </w:p>
-    <w:p>
-      <w:pPr/>
-      <w:r>
-        <w:t>Why this matters: it proves the normal finance path works after the gate passes.</w:t>
-      </w:r>
-    </w:p>
-    <w:p>
-      <w:pPr>
-        <w:pStyle w:val="ListNumber"/>
-      </w:pPr>
-      <w:r>
-        <w:t>If the gate blocks, read `Why blocked` and fix the missing identity, permission, trust, or approval.</w:t>
-      </w:r>
-    </w:p>
-    <w:p>
-      <w:pPr/>
-      <w:r>
-        <w:t>Why this matters: the block message tells you exactly which part of the rule failed.</w:t>
-      </w:r>
-    </w:p>
-    <w:p>
-      <w:pPr>
-        <w:pStyle w:val="ListNumber"/>
-      </w:pPr>
-      <w:r>
-        <w:t>If the action needs approval, open `Approval Queue`.</w:t>
-      </w:r>
-    </w:p>
-    <w:p>
-      <w:pPr/>
-      <w:r>
-        <w:t>Why this matters: approval-required actions should pause for human review.</w:t>
-      </w:r>
-    </w:p>
-    <w:p>
-      <w:pPr>
-        <w:pStyle w:val="ListNumber"/>
-      </w:pPr>
-      <w:r>
-        <w:t>Review the pending request.</w:t>
-      </w:r>
-    </w:p>
-    <w:p>
-      <w:pPr/>
-      <w:r>
-        <w:t>Why this matters: you need to confirm the request is the one you meant to test.</w:t>
-      </w:r>
-    </w:p>
-    <w:p>
-      <w:pPr>
-        <w:pStyle w:val="ListNumber"/>
-      </w:pPr>
-      <w:r>
-        <w:t>Approve or deny the request.</w:t>
-      </w:r>
-    </w:p>
-    <w:p>
-      <w:pPr/>
-      <w:r>
-        <w:t>Why this matters: this is the human decision point for sensitive actions.</w:t>
-      </w:r>
-    </w:p>
-    <w:p>
-      <w:pPr>
-        <w:pStyle w:val="ListNumber"/>
-      </w:pPr>
-      <w:r>
-        <w:t>Try the action again if approval was granted.</w:t>
-      </w:r>
-    </w:p>
-    <w:p>
-      <w:pPr/>
-      <w:r>
-        <w:t>Why this matters: the action should only continue after approval has been recorded.</w:t>
-      </w:r>
-    </w:p>
-    <w:p>
-      <w:pPr>
-        <w:pStyle w:val="ListNumber"/>
-      </w:pPr>
-      <w:r>
-        <w:t>Open `Audit Log` and confirm the decision was recorded.</w:t>
-      </w:r>
-    </w:p>
-    <w:p>
-      <w:pPr/>
-      <w:r>
-        <w:t>Why this matters: the audit trail proves what happened and why.</w:t>
-      </w:r>
-    </w:p>
-    <w:p>
-      <w:pPr/>
-      <w:r>
-        <w:t>What you should see:</w:t>
-      </w:r>
-    </w:p>
-    <w:p>
-      <w:pPr>
-        <w:pStyle w:val="ListBullet"/>
-      </w:pPr>
-      <w:r>
-        <w:t>The Treasury gate shows the selected user and device.</w:t>
-      </w:r>
-    </w:p>
-    <w:p>
-      <w:pPr>
-        <w:pStyle w:val="ListBullet"/>
-      </w:pPr>
-      <w:r>
-        <w:t>A valid Treasury setup opens the screen.</w:t>
-      </w:r>
-    </w:p>
-    <w:p>
-      <w:pPr>
-        <w:pStyle w:val="ListBullet"/>
-      </w:pPr>
-      <w:r>
-        <w:t>A bad setup shows `Why blocked`.</w:t>
-      </w:r>
-    </w:p>
-    <w:p>
-      <w:pPr>
-        <w:pStyle w:val="ListBullet"/>
-      </w:pPr>
-      <w:r>
-        <w:t>An approval-only action moves into `Approval Queue`.</w:t>
-      </w:r>
-    </w:p>
-    <w:p>
-      <w:pPr>
-        <w:pStyle w:val="ListBullet"/>
-      </w:pPr>
-      <w:r>
-        <w:t>The final decision appears in `Audit Log`.</w:t>
-      </w:r>
-    </w:p>
-    <w:p>
-      <w:pPr>
-        <w:pStyle w:val="Heading2"/>
-      </w:pPr>
-      <w:r>
-        <w:t>Step-by-step access system walkthrough</w:t>
-      </w:r>
-    </w:p>
-    <w:p>
-      <w:pPr/>
-      <w:r>
-        <w:t>Use this when you want to test the whole access system from start to finish.</w:t>
-      </w:r>
-    </w:p>
-    <w:p>
-      <w:pPr>
-        <w:pStyle w:val="ListNumber"/>
-      </w:pPr>
-      <w:r>
-        <w:t>Open `Users &amp; Devices Control`.</w:t>
-      </w:r>
-    </w:p>
-    <w:p>
-      <w:pPr/>
-      <w:r>
-        <w:t>Why this matters: you want the access system reset to a known local state.</w:t>
-      </w:r>
-    </w:p>
-    <w:p>
-      <w:pPr>
-        <w:pStyle w:val="ListNumber"/>
-      </w:pPr>
-      <w:r>
-        <w:t>Click `Reset demo data`.</w:t>
-      </w:r>
-    </w:p>
-    <w:p>
-      <w:pPr/>
-      <w:r>
-        <w:t>Why this matters: a clean seed state makes the later test results easier to trust.</w:t>
-      </w:r>
-    </w:p>
-    <w:p>
-      <w:pPr>
-        <w:pStyle w:val="ListNumber"/>
-      </w:pPr>
-      <w:r>
-        <w:t>Open `Users` and check the sample users.</w:t>
-      </w:r>
-    </w:p>
-    <w:p>
-      <w:pPr/>
-      <w:r>
-        <w:t>Why this matters: you need to know which identities are available for the test.</w:t>
-      </w:r>
-    </w:p>
-    <w:p>
-      <w:pPr>
-        <w:pStyle w:val="ListNumber"/>
-      </w:pPr>
-      <w:r>
-        <w:t>Open `Devices` and compare the trust levels.</w:t>
-      </w:r>
-    </w:p>
-    <w:p>
-      <w:pPr/>
-      <w:r>
-        <w:t>Why this matters: the trust floor only makes sense when you compare devices side by side.</w:t>
-      </w:r>
-    </w:p>
-    <w:p>
-      <w:pPr>
-        <w:pStyle w:val="ListNumber"/>
-      </w:pPr>
-      <w:r>
-        <w:t>Open `Access Matrix` and inspect Treasury rules.</w:t>
-      </w:r>
-    </w:p>
-    <w:p>
-      <w:pPr/>
-      <w:r>
-        <w:t>Why this matters: the rule tells you what the gate will accept or reject.</w:t>
-      </w:r>
-    </w:p>
-    <w:p>
-      <w:pPr>
-        <w:pStyle w:val="ListNumber"/>
-      </w:pPr>
-      <w:r>
-        <w:t>Open the Treasury gate with a trusted user and device.</w:t>
-      </w:r>
-    </w:p>
-    <w:p>
-      <w:pPr/>
-      <w:r>
-        <w:t>Why this matters: this is the main allow path you want to prove works.</w:t>
-      </w:r>
-    </w:p>
-    <w:p>
-      <w:pPr>
-        <w:pStyle w:val="ListNumber"/>
-      </w:pPr>
-      <w:r>
-        <w:t>Confirm the allow path works.</w:t>
-      </w:r>
-    </w:p>
-    <w:p>
-      <w:pPr/>
-      <w:r>
-        <w:t>Why this matters: it shows the basic role, trust, and permission combo is valid.</w:t>
-      </w:r>
-    </w:p>
-    <w:p>
-      <w:pPr>
-        <w:pStyle w:val="ListNumber"/>
-      </w:pPr>
-      <w:r>
-        <w:t>Switch to a lower-trust device and confirm the block path works.</w:t>
-      </w:r>
-    </w:p>
-    <w:p>
-      <w:pPr/>
-      <w:r>
-        <w:t>Why this matters: the system should reject devices that do not meet Treasury's trust floor.</w:t>
-      </w:r>
-    </w:p>
-    <w:p>
-      <w:pPr>
-        <w:pStyle w:val="ListNumber"/>
-      </w:pPr>
-      <w:r>
-        <w:t>Switch to a lighter user and confirm the permission block works.</w:t>
-      </w:r>
-    </w:p>
-    <w:p>
-      <w:pPr/>
-      <w:r>
-        <w:t>Why this matters: the system should reject users who lack the needed finance access.</w:t>
-      </w:r>
-    </w:p>
-    <w:p>
-      <w:pPr>
-        <w:pStyle w:val="ListNumber"/>
-      </w:pPr>
-      <w:r>
-        <w:t>Trigger an approval-required action and confirm it pauses for review.</w:t>
-      </w:r>
-    </w:p>
-    <w:p>
-      <w:pPr/>
-      <w:r>
-        <w:t>Why this matters: sensitive actions should not execute instantly.</w:t>
-      </w:r>
-    </w:p>
-    <w:p>
-      <w:pPr>
-        <w:pStyle w:val="ListNumber"/>
-      </w:pPr>
-      <w:r>
-        <w:t>Open `Approval Queue` and process the request.</w:t>
-      </w:r>
-    </w:p>
-    <w:p>
-      <w:pPr/>
-      <w:r>
-        <w:t>Why this matters: human review is the control point for risky actions.</w:t>
-      </w:r>
-    </w:p>
-    <w:p>
-      <w:pPr>
-        <w:pStyle w:val="ListNumber"/>
-      </w:pPr>
-      <w:r>
-        <w:t>Review the result in `Audit Log`.</w:t>
-      </w:r>
-    </w:p>
-    <w:p>
-      <w:pPr/>
-      <w:r>
-        <w:t>Why this matters: every allow, deny, or approval should leave a trace.</w:t>
-      </w:r>
-    </w:p>
-    <w:p>
-      <w:pPr>
-        <w:pStyle w:val="ListNumber"/>
-      </w:pPr>
-      <w:r>
-        <w:t>Open `Device Onboarding` and register a sample device if you want to test trust setup.</w:t>
-      </w:r>
-    </w:p>
-    <w:p>
-      <w:pPr/>
-      <w:r>
-        <w:t>Why this matters: onboarding is how a device becomes trusted enough for later access.</w:t>
-      </w:r>
-    </w:p>
-    <w:p>
-      <w:pPr>
-        <w:pStyle w:val="ListNumber"/>
-      </w:pPr>
-      <w:r>
-        <w:t>Open `Security Lock` and confirm the selected context matches what you expect.</w:t>
-      </w:r>
-    </w:p>
-    <w:p>
-      <w:pPr/>
-      <w:r>
-        <w:t>Why this matters: the lock view is a quick sanity check for the current local context.</w:t>
-      </w:r>
-    </w:p>
-    <w:p>
-      <w:pPr>
-        <w:pStyle w:val="ListNumber"/>
-      </w:pPr>
-      <w:r>
-        <w:t>Reset demo data and repeat the flow until the results feel familiar.</w:t>
-      </w:r>
-    </w:p>
-    <w:p>
-      <w:pPr/>
-      <w:r>
-        <w:t>Why this matters: repetition makes the rules easier to trust and remember.</w:t>
-      </w:r>
-    </w:p>
-    <w:p>
-      <w:pPr/>
-      <w:r>
-        <w:t>What you should see:</w:t>
-      </w:r>
-    </w:p>
-    <w:p>
-      <w:pPr>
-        <w:pStyle w:val="ListBullet"/>
-      </w:pPr>
-      <w:r>
-        <w:t>The trusted user and device path is allowed.</w:t>
-      </w:r>
-    </w:p>
-    <w:p>
-      <w:pPr>
-        <w:pStyle w:val="ListBullet"/>
-      </w:pPr>
-      <w:r>
-        <w:t>The low-trust device path is blocked.</w:t>
-      </w:r>
-    </w:p>
-    <w:p>
-      <w:pPr>
-        <w:pStyle w:val="ListBullet"/>
-      </w:pPr>
-      <w:r>
-        <w:t>The lighter user path is blocked for permission reasons.</w:t>
-      </w:r>
-    </w:p>
-    <w:p>
-      <w:pPr>
-        <w:pStyle w:val="ListBullet"/>
-      </w:pPr>
-      <w:r>
-        <w:t>The approval path pauses until review happens.</w:t>
-      </w:r>
-    </w:p>
-    <w:p>
-      <w:pPr>
-        <w:pStyle w:val="ListBullet"/>
-      </w:pPr>
-      <w:r>
-        <w:t>Device onboarding writes a new trusted record.</w:t>
-      </w:r>
-    </w:p>
-    <w:p>
-      <w:pPr>
-        <w:pStyle w:val="ListBullet"/>
-      </w:pPr>
-      <w:r>
-        <w:t>Security Lock matches the current local context.</w:t>
-      </w:r>
-    </w:p>
-    <w:p>
-      <w:pPr>
-        <w:pStyle w:val="Heading2"/>
-      </w:pPr>
-      <w:r>
-        <w:t>What each screen is for</w:t>
-      </w:r>
-    </w:p>
-    <w:p>
-      <w:pPr>
-        <w:pStyle w:val="Heading3"/>
-      </w:pPr>
-      <w:r>
-        <w:t>Users</w:t>
-      </w:r>
-    </w:p>
-    <w:p>
-      <w:pPr/>
-      <w:r>
-        <w:t>Check the person. Confirm the role, permissions, and linked devices.</w:t>
-      </w:r>
-    </w:p>
-    <w:p>
-      <w:pPr>
-        <w:pStyle w:val="Heading3"/>
-      </w:pPr>
-      <w:r>
-        <w:t>Devices</w:t>
-      </w:r>
-    </w:p>
-    <w:p>
-      <w:pPr/>
-      <w:r>
-        <w:t>Check the device. Confirm the trust level, owner, and allowed actions.</w:t>
-      </w:r>
-    </w:p>
-    <w:p>
-      <w:pPr>
-        <w:pStyle w:val="Heading3"/>
-      </w:pPr>
-      <w:r>
-        <w:t>Access Matrix</w:t>
-      </w:r>
-    </w:p>
-    <w:p>
-      <w:pPr/>
-      <w:r>
-        <w:t>Check the rule. Confirm the required permission, trust floor, and approval rules.</w:t>
-      </w:r>
-    </w:p>
-    <w:p>
-      <w:pPr>
-        <w:pStyle w:val="Heading3"/>
-      </w:pPr>
-      <w:r>
-        <w:t>Device Onboarding</w:t>
-      </w:r>
-    </w:p>
-    <w:p>
-      <w:pPr/>
-      <w:r>
-        <w:t>Use this when a new device needs to become trusted.</w:t>
-      </w:r>
-    </w:p>
-    <w:p>
-      <w:pPr>
-        <w:pStyle w:val="Heading3"/>
-      </w:pPr>
-      <w:r>
-        <w:t>Approval Queue</w:t>
-      </w:r>
-    </w:p>
-    <w:p>
-      <w:pPr/>
-      <w:r>
-        <w:t>Use this when a valid action needs human review before it can continue.</w:t>
-      </w:r>
-    </w:p>
-    <w:p>
-      <w:pPr>
-        <w:pStyle w:val="Heading3"/>
-      </w:pPr>
-      <w:r>
-        <w:t>Audit Log</w:t>
-      </w:r>
-    </w:p>
-    <w:p>
-      <w:pPr/>
-      <w:r>
-        <w:t>Use this to verify what happened and why the system allowed, denied, or paused access.</w:t>
-      </w:r>
-    </w:p>
-    <w:p>
-      <w:pPr>
-        <w:pStyle w:val="Heading2"/>
-      </w:pPr>
-      <w:r>
-        <w:t>Full Treasury walkthrough</w:t>
-      </w:r>
-    </w:p>
-    <w:p>
-      <w:pPr/>
-      <w:r>
-        <w:t>Use this if you want the Treasury-only version with a tighter path.</w:t>
-      </w:r>
-    </w:p>
-    <w:p>
-      <w:pPr>
-        <w:pStyle w:val="ListNumber"/>
-      </w:pPr>
-      <w:r>
-        <w:t>Open the Dashboard Module Hub.</w:t>
-      </w:r>
-    </w:p>
-    <w:p>
-      <w:pPr/>
-      <w:r>
-        <w:t>Why this matters: this is the entry point where you first reach the control layer.</w:t>
-      </w:r>
-    </w:p>
-    <w:p>
-      <w:pPr>
-        <w:pStyle w:val="ListNumber"/>
-      </w:pPr>
-      <w:r>
-        <w:t>Select `Users &amp; Devices Control`.</w:t>
-      </w:r>
-    </w:p>
-    <w:p>
-      <w:pPr/>
-      <w:r>
-        <w:t>Why this matters: Treasury cannot be checked until the local registry is open.</w:t>
-      </w:r>
-    </w:p>
-    <w:p>
-      <w:pPr>
-        <w:pStyle w:val="ListNumber"/>
-      </w:pPr>
-      <w:r>
-        <w:t>Open `Users` and confirm the finance user is active.</w:t>
-      </w:r>
-    </w:p>
-    <w:p>
-      <w:pPr/>
-      <w:r>
-        <w:t>Why this matters: the person has to exist and be active before finance access can work.</w:t>
-      </w:r>
-    </w:p>
-    <w:p>
-      <w:pPr>
-        <w:pStyle w:val="ListNumber"/>
-      </w:pPr>
-      <w:r>
-        <w:t>Open `Devices` and confirm the device is trusted enough.</w:t>
-      </w:r>
-    </w:p>
-    <w:p>
-      <w:pPr/>
-      <w:r>
-        <w:t>Why this matters: Treasury depends on device trust as well as user identity.</w:t>
-      </w:r>
-    </w:p>
-    <w:p>
-      <w:pPr>
-        <w:pStyle w:val="ListNumber"/>
-      </w:pPr>
-      <w:r>
-        <w:t>Open `Access Matrix` and confirm Treasury needs the right permission and trust floor.</w:t>
-      </w:r>
-    </w:p>
-    <w:p>
-      <w:pPr/>
-      <w:r>
-        <w:t>Why this matters: this tells you exactly what the gate will require.</w:t>
-      </w:r>
-    </w:p>
-    <w:p>
-      <w:pPr>
-        <w:pStyle w:val="ListNumber"/>
-      </w:pPr>
-      <w:r>
-        <w:t>Open the Treasury gate.</w:t>
-      </w:r>
-    </w:p>
-    <w:p>
-      <w:pPr/>
-      <w:r>
-        <w:t>Why this matters: this is the actual allow/deny checkpoint.</w:t>
-      </w:r>
-    </w:p>
-    <w:p>
-      <w:pPr>
-        <w:pStyle w:val="ListNumber"/>
-      </w:pPr>
-      <w:r>
-        <w:t>Select the user and device.</w:t>
-      </w:r>
-    </w:p>
-    <w:p>
-      <w:pPr/>
-      <w:r>
-        <w:t>Why this matters: the gate uses both selections together.</w:t>
-      </w:r>
-    </w:p>
-    <w:p>
-      <w:pPr>
-        <w:pStyle w:val="ListNumber"/>
-      </w:pPr>
-      <w:r>
-        <w:t>Click `Open screen`.</w:t>
-      </w:r>
-    </w:p>
-    <w:p>
-      <w:pPr/>
-      <w:r>
-        <w:t>Why this matters: this is the moment the gate decides whether to let Treasury open.</w:t>
-      </w:r>
-    </w:p>
-    <w:p>
-      <w:pPr>
-        <w:pStyle w:val="ListNumber"/>
-      </w:pPr>
-      <w:r>
-        <w:t>If blocked, read `Why blocked` and fix the missing identity, permission, trust, or approval.</w:t>
-      </w:r>
-    </w:p>
-    <w:p>
-      <w:pPr/>
-      <w:r>
-        <w:t>Why this matters: the block message points to the exact missing piece.</w:t>
-      </w:r>
-    </w:p>
-    <w:p>
-      <w:pPr>
-        <w:pStyle w:val="ListNumber"/>
-      </w:pPr>
-      <w:r>
-        <w:t>If approval is needed, review `Approval Queue`, approve or deny it, then try again.</w:t>
-      </w:r>
-    </w:p>
-    <w:p>
-      <w:pPr/>
-      <w:r>
-        <w:t>Why this matters: sensitive actions should pause for a human decision.</w:t>
-      </w:r>
-    </w:p>
-    <w:p>
-      <w:pPr>
-        <w:pStyle w:val="ListNumber"/>
-      </w:pPr>
-      <w:r>
-        <w:t>Open `Audit Log` and confirm the decision was recorded.</w:t>
-      </w:r>
-    </w:p>
-    <w:p>
-      <w:pPr/>
-      <w:r>
-        <w:t>Why this matters: the audit trail proves what happened and why.</w:t>
-      </w:r>
-    </w:p>
-    <w:p>
-      <w:pPr>
-        <w:pStyle w:val="Heading2"/>
-      </w:pPr>
-      <w:r>
-        <w:t>If something looks wrong</w:t>
-      </w:r>
-    </w:p>
-    <w:p>
-      <w:pPr/>
-      <w:r>
-        <w:t>Check these first:</w:t>
-      </w:r>
-    </w:p>
-    <w:p>
-      <w:pPr>
-        <w:pStyle w:val="ListBullet"/>
-      </w:pPr>
-      <w:r>
-        <w:t>Is the selected user archived?</w:t>
-      </w:r>
-    </w:p>
-    <w:p>
-      <w:pPr>
-        <w:pStyle w:val="ListBullet"/>
-      </w:pPr>
-      <w:r>
-        <w:t>Is the selected device blocked or low trust?</w:t>
-      </w:r>
-    </w:p>
-    <w:p>
-      <w:pPr>
-        <w:pStyle w:val="ListBullet"/>
-      </w:pPr>
-      <w:r>
-        <w:t>Does the role have the right permission?</w:t>
-      </w:r>
-    </w:p>
-    <w:p>
-      <w:pPr>
-        <w:pStyle w:val="ListBullet"/>
-      </w:pPr>
-      <w:r>
-        <w:t>Is the action waiting for approval?</w:t>
-      </w:r>
-    </w:p>
-    <w:p>
-      <w:pPr>
-        <w:pStyle w:val="ListBullet"/>
-      </w:pPr>
-      <w:r>
-        <w:t>Did the gate write an audit event?</w:t>
-      </w:r>
-    </w:p>
-    <w:p>
-      <w:pPr>
-        <w:pStyle w:val="Heading2"/>
-      </w:pPr>
-      <w:r>
-        <w:t>Common mistakes</w:t>
-      </w:r>
-    </w:p>
-    <w:p>
-      <w:pPr/>
-      <w:r>
-        <w:t>These are the most common reasons a test does not behave as expected.</w:t>
-      </w:r>
-    </w:p>
-    <w:p>
-      <w:pPr>
-        <w:pStyle w:val="ListBullet"/>
-      </w:pPr>
-      <w:r>
-        <w:t>You clicked `Open screen` before selecting both the user and the device.</w:t>
-      </w:r>
-    </w:p>
-    <w:p>
-      <w:pPr>
-        <w:pStyle w:val="ListBullet"/>
-      </w:pPr>
-      <w:r>
-        <w:t>You used a low-trust device for the Treasury path.</w:t>
-      </w:r>
-    </w:p>
-    <w:p>
-      <w:pPr>
-        <w:pStyle w:val="ListBullet"/>
-      </w:pPr>
-      <w:r>
-        <w:t>You tested a user that does not have finance permissions.</w:t>
-      </w:r>
-    </w:p>
-    <w:p>
-      <w:pPr>
-        <w:pStyle w:val="ListBullet"/>
-      </w:pPr>
-      <w:r>
-        <w:t>You forgot to reset the demo data after changing the seed state.</w:t>
-      </w:r>
-    </w:p>
-    <w:p>
-      <w:pPr>
-        <w:pStyle w:val="ListBullet"/>
-      </w:pPr>
-      <w:r>
-        <w:t>You looked for the approval result before processing the request in `Approval Queue`.</w:t>
-      </w:r>
-    </w:p>
-    <w:p>
-      <w:pPr>
-        <w:pStyle w:val="ListBullet"/>
-      </w:pPr>
-      <w:r>
-        <w:t>You expected the audit log to change before the action was actually allowed or denied.</w:t>
-      </w:r>
-    </w:p>
-    <w:p>
-      <w:pPr>
-        <w:pStyle w:val="ListBullet"/>
-      </w:pPr>
-      <w:r>
-        <w:t>You seeded a new item but did not refresh or re-open the relevant screen.</w:t>
-      </w:r>
-    </w:p>
-    <w:p>
-      <w:pPr>
-        <w:pStyle w:val="Heading2"/>
-      </w:pPr>
-      <w:r>
-        <w:t>Safe habit</w:t>
-      </w:r>
-    </w:p>
-    <w:p>
-      <w:pPr/>
-      <w:r>
-        <w:t>For Treasury, always check:</w:t>
-      </w:r>
-    </w:p>
-    <w:p>
-      <w:pPr>
-        <w:pStyle w:val="ListNumber"/>
-      </w:pPr>
-      <w:r>
-        <w:t>the person</w:t>
-      </w:r>
-    </w:p>
-    <w:p>
-      <w:pPr>
-        <w:pStyle w:val="ListNumber"/>
-      </w:pPr>
-      <w:r>
-        <w:t>the device</w:t>
-      </w:r>
-    </w:p>
-    <w:p>
-      <w:pPr>
-        <w:pStyle w:val="ListNumber"/>
-      </w:pPr>
-      <w:r>
-        <w:t>the permission</w:t>
-      </w:r>
-    </w:p>
-    <w:p>
-      <w:pPr>
-        <w:pStyle w:val="ListNumber"/>
-      </w:pPr>
-      <w:r>
-        <w:t>the trust floor</w:t>
-      </w:r>
-    </w:p>
-    <w:p>
-      <w:pPr>
-        <w:pStyle w:val="ListNumber"/>
-      </w:pPr>
-      <w:r>
-        <w:t>whether the action needs approval</w:t>
-      </w:r>
-    </w:p>
-    <w:p>
-      <w:pPr>
-        <w:pStyle w:val="ListNumber"/>
-      </w:pPr>
-      <w:r>
-        <w:t>the audit trail</w:t>
+        <w:t>Turn it off again if you want startup to go straight from Security Lock to the dashboard.</w:t>
+      </w:r>
+    </w:p>
+    <w:p>
+      <w:r>
+        <w:t>Top-left security session box</w:t>
+      </w:r>
+    </w:p>
+    <w:p>
+      <w:r>
+        <w:t>Use this when you want a quick live read on the current session during testing.</w:t>
+      </w:r>
+    </w:p>
+    <w:p>
+      <w:r>
+        <w:t>It shows the active or locked state, the active user, whether that user is online, the connected time, the timeout window, and the countdown to expiry.</w:t>
+      </w:r>
+    </w:p>
+    <w:p>
+      <w:r>
+        <w:t>Tap it to return to Security Lock or open Access Matrix.</w:t>
+      </w:r>
+    </w:p>
+    <w:p>
+      <w:r>
+        <w:t>Quick checks for the session box</w:t>
+      </w:r>
+    </w:p>
+    <w:p>
+      <w:r>
+        <w:t>- Active user should match the person you just unlocked with</w:t>
+      </w:r>
+    </w:p>
+    <w:p>
+      <w:r>
+        <w:t>- Status: online should appear when the local session is active</w:t>
+      </w:r>
+    </w:p>
+    <w:p>
+      <w:r>
+        <w:t>- The countdown should keep moving once per second</w:t>
       </w:r>
     </w:p>
     <w:sectPr>

</xml_diff>